<commit_message>
User guide (EN): Reports page without screenshots - one section per group, report name and what it produces
Co-Authored-By: Claude Sonnet 5.5 <noreply@anthropic.com>
Claude-Session: https://claude.ai/code/session_019dELNUNjVMr3Ja2mUwBrCu
</commit_message>
<xml_diff>
--- a/docs/user-guide/en/pages/15-reports.docx
+++ b/docs/user-guide/en/pages/15-reports.docx
@@ -56,56 +56,9 @@
         <w:t xml:space="preserve">Store Operations</w:t>
       </w:r>
     </w:p>
-    <w:p>
-      <w:pPr>
-        <w:keepNext w:val="false"/>
-        <w:spacing w:after="120" w:before="60"/>
-        <w:jc w:val="center"/>
-      </w:pPr>
-      <w:r>
-        <w:drawing>
-          <wp:inline distT="0" distB="0" distL="0" distR="0">
-            <wp:extent cx="6953250" cy="733425"/>
-            <wp:effectExtent t="0" r="0" b="0" l="0"/>
-            <wp:docPr id="1" name="" descr="" title=""/>
-            <wp:cNvGraphicFramePr>
-              <a:graphicFrameLocks xmlns:a="http://schemas.openxmlformats.org/drawingml/2006/main" noChangeAspect="1"/>
-            </wp:cNvGraphicFramePr>
-            <a:graphic xmlns:a="http://schemas.openxmlformats.org/drawingml/2006/main">
-              <a:graphicData uri="http://schemas.openxmlformats.org/drawingml/2006/picture">
-                <pic:pic xmlns:pic="http://schemas.openxmlformats.org/drawingml/2006/picture">
-                  <pic:nvPicPr>
-                    <pic:cNvPr id="0" name="" descr=""/>
-                    <pic:cNvPicPr>
-                      <a:picLocks noChangeAspect="1" noChangeArrowheads="1"/>
-                    </pic:cNvPicPr>
-                  </pic:nvPicPr>
-                  <pic:blipFill>
-                    <a:blip r:embed="rId9" cstate="none"/>
-                    <a:srcRect/>
-                    <a:stretch>
-                      <a:fillRect/>
-                    </a:stretch>
-                  </pic:blipFill>
-                  <pic:spPr bwMode="auto">
-                    <a:xfrm>
-                      <a:off x="0" y="0"/>
-                      <a:ext cx="6953250" cy="733425"/>
-                    </a:xfrm>
-                    <a:prstGeom prst="rect">
-                      <a:avLst/>
-                    </a:prstGeom>
-                  </pic:spPr>
-                </pic:pic>
-              </a:graphicData>
-            </a:graphic>
-          </wp:inline>
-        </w:drawing>
-      </w:r>
-    </w:p>
     <w:tbl>
       <w:tblPr>
-        <w:tblW w:type="dxa" w:w="9400"/>
+        <w:tblW w:type="dxa" w:w="11000"/>
         <w:tblBorders>
           <w:top w:val="single" w:color="auto" w:sz="4"/>
           <w:left w:val="single" w:color="auto" w:sz="4"/>
@@ -116,8 +69,8 @@
         </w:tblBorders>
       </w:tblPr>
       <w:tblGrid>
-        <w:gridCol w:w="2600"/>
-        <w:gridCol w:w="6800"/>
+        <w:gridCol w:w="2800"/>
+        <w:gridCol w:w="8200"/>
       </w:tblGrid>
       <w:tr>
         <w:trPr>
@@ -126,7 +79,7 @@
         </w:trPr>
         <w:tc>
           <w:tcPr>
-            <w:tcW w:type="dxa" w:w="2600"/>
+            <w:tcW w:type="dxa" w:w="2800"/>
             <w:tcBorders>
               <w:top w:val="single" w:color="D9D9D6" w:sz="4"/>
               <w:left w:val="single" w:color="D9D9D6" w:sz="4"/>
@@ -142,6 +95,9 @@
             </w:tcMar>
           </w:tcPr>
           <w:p>
+            <w:pPr>
+              <w:keepNext/>
+            </w:pPr>
             <w:r>
               <w:rPr>
                 <w:rFonts w:ascii="Arial" w:cs="Arial" w:eastAsia="Arial" w:hAnsi="Arial"/>
@@ -157,7 +113,7 @@
         </w:tc>
         <w:tc>
           <w:tcPr>
-            <w:tcW w:type="dxa" w:w="6800"/>
+            <w:tcW w:type="dxa" w:w="8200"/>
             <w:tcBorders>
               <w:top w:val="single" w:color="D9D9D6" w:sz="4"/>
               <w:left w:val="single" w:color="D9D9D6" w:sz="4"/>
@@ -173,6 +129,9 @@
             </w:tcMar>
           </w:tcPr>
           <w:p>
+            <w:pPr>
+              <w:keepNext/>
+            </w:pPr>
             <w:r>
               <w:rPr>
                 <w:rFonts w:ascii="Arial" w:cs="Arial" w:eastAsia="Arial" w:hAnsi="Arial"/>
@@ -194,22 +153,25 @@
         </w:trPr>
         <w:tc>
           <w:tcPr>
-            <w:tcW w:type="dxa" w:w="2600"/>
-            <w:tcBorders>
-              <w:top w:val="single" w:color="D9D9D6" w:sz="4"/>
-              <w:left w:val="single" w:color="D9D9D6" w:sz="4"/>
-              <w:bottom w:val="single" w:color="D9D9D6" w:sz="4"/>
-              <w:right w:val="single" w:color="D9D9D6" w:sz="4"/>
-            </w:tcBorders>
-            <w:shd w:fill="FFFFFF" w:color="auto" w:val="clear"/>
-            <w:tcMar>
-              <w:top w:type="dxa" w:w="70"/>
-              <w:left w:type="dxa" w:w="110"/>
-              <w:bottom w:type="dxa" w:w="70"/>
-              <w:right w:type="dxa" w:w="110"/>
-            </w:tcMar>
-          </w:tcPr>
-          <w:p>
+            <w:tcW w:type="dxa" w:w="2800"/>
+            <w:tcBorders>
+              <w:top w:val="single" w:color="D9D9D6" w:sz="4"/>
+              <w:left w:val="single" w:color="D9D9D6" w:sz="4"/>
+              <w:bottom w:val="single" w:color="D9D9D6" w:sz="4"/>
+              <w:right w:val="single" w:color="D9D9D6" w:sz="4"/>
+            </w:tcBorders>
+            <w:shd w:fill="FFFFFF" w:color="auto" w:val="clear"/>
+            <w:tcMar>
+              <w:top w:type="dxa" w:w="70"/>
+              <w:left w:type="dxa" w:w="110"/>
+              <w:bottom w:type="dxa" w:w="70"/>
+              <w:right w:type="dxa" w:w="110"/>
+            </w:tcMar>
+          </w:tcPr>
+          <w:p>
+            <w:pPr>
+              <w:keepNext/>
+            </w:pPr>
             <w:r>
               <w:rPr>
                 <w:rFonts w:ascii="Arial" w:cs="Arial" w:eastAsia="Arial" w:hAnsi="Arial"/>
@@ -223,22 +185,25 @@
         </w:tc>
         <w:tc>
           <w:tcPr>
-            <w:tcW w:type="dxa" w:w="6800"/>
-            <w:tcBorders>
-              <w:top w:val="single" w:color="D9D9D6" w:sz="4"/>
-              <w:left w:val="single" w:color="D9D9D6" w:sz="4"/>
-              <w:bottom w:val="single" w:color="D9D9D6" w:sz="4"/>
-              <w:right w:val="single" w:color="D9D9D6" w:sz="4"/>
-            </w:tcBorders>
-            <w:shd w:fill="FFFFFF" w:color="auto" w:val="clear"/>
-            <w:tcMar>
-              <w:top w:type="dxa" w:w="70"/>
-              <w:left w:type="dxa" w:w="110"/>
-              <w:bottom w:type="dxa" w:w="70"/>
-              <w:right w:type="dxa" w:w="110"/>
-            </w:tcMar>
-          </w:tcPr>
-          <w:p>
+            <w:tcW w:type="dxa" w:w="8200"/>
+            <w:tcBorders>
+              <w:top w:val="single" w:color="D9D9D6" w:sz="4"/>
+              <w:left w:val="single" w:color="D9D9D6" w:sz="4"/>
+              <w:bottom w:val="single" w:color="D9D9D6" w:sz="4"/>
+              <w:right w:val="single" w:color="D9D9D6" w:sz="4"/>
+            </w:tcBorders>
+            <w:shd w:fill="FFFFFF" w:color="auto" w:val="clear"/>
+            <w:tcMar>
+              <w:top w:type="dxa" w:w="70"/>
+              <w:left w:type="dxa" w:w="110"/>
+              <w:bottom w:type="dxa" w:w="70"/>
+              <w:right w:type="dxa" w:w="110"/>
+            </w:tcMar>
+          </w:tcPr>
+          <w:p>
+            <w:pPr>
+              <w:keepNext/>
+            </w:pPr>
             <w:r>
               <w:rPr>
                 <w:rFonts w:ascii="Arial" w:cs="Arial" w:eastAsia="Arial" w:hAnsi="Arial"/>
@@ -258,22 +223,25 @@
         </w:trPr>
         <w:tc>
           <w:tcPr>
-            <w:tcW w:type="dxa" w:w="2600"/>
-            <w:tcBorders>
-              <w:top w:val="single" w:color="D9D9D6" w:sz="4"/>
-              <w:left w:val="single" w:color="D9D9D6" w:sz="4"/>
-              <w:bottom w:val="single" w:color="D9D9D6" w:sz="4"/>
-              <w:right w:val="single" w:color="D9D9D6" w:sz="4"/>
-            </w:tcBorders>
-            <w:shd w:fill="FFFFFF" w:color="auto" w:val="clear"/>
-            <w:tcMar>
-              <w:top w:type="dxa" w:w="70"/>
-              <w:left w:type="dxa" w:w="110"/>
-              <w:bottom w:type="dxa" w:w="70"/>
-              <w:right w:type="dxa" w:w="110"/>
-            </w:tcMar>
-          </w:tcPr>
-          <w:p>
+            <w:tcW w:type="dxa" w:w="2800"/>
+            <w:tcBorders>
+              <w:top w:val="single" w:color="D9D9D6" w:sz="4"/>
+              <w:left w:val="single" w:color="D9D9D6" w:sz="4"/>
+              <w:bottom w:val="single" w:color="D9D9D6" w:sz="4"/>
+              <w:right w:val="single" w:color="D9D9D6" w:sz="4"/>
+            </w:tcBorders>
+            <w:shd w:fill="FFFFFF" w:color="auto" w:val="clear"/>
+            <w:tcMar>
+              <w:top w:type="dxa" w:w="70"/>
+              <w:left w:type="dxa" w:w="110"/>
+              <w:bottom w:type="dxa" w:w="70"/>
+              <w:right w:type="dxa" w:w="110"/>
+            </w:tcMar>
+          </w:tcPr>
+          <w:p>
+            <w:pPr>
+              <w:keepNext/>
+            </w:pPr>
             <w:r>
               <w:rPr>
                 <w:rFonts w:ascii="Arial" w:cs="Arial" w:eastAsia="Arial" w:hAnsi="Arial"/>
@@ -287,22 +255,25 @@
         </w:tc>
         <w:tc>
           <w:tcPr>
-            <w:tcW w:type="dxa" w:w="6800"/>
-            <w:tcBorders>
-              <w:top w:val="single" w:color="D9D9D6" w:sz="4"/>
-              <w:left w:val="single" w:color="D9D9D6" w:sz="4"/>
-              <w:bottom w:val="single" w:color="D9D9D6" w:sz="4"/>
-              <w:right w:val="single" w:color="D9D9D6" w:sz="4"/>
-            </w:tcBorders>
-            <w:shd w:fill="FFFFFF" w:color="auto" w:val="clear"/>
-            <w:tcMar>
-              <w:top w:type="dxa" w:w="70"/>
-              <w:left w:type="dxa" w:w="110"/>
-              <w:bottom w:type="dxa" w:w="70"/>
-              <w:right w:type="dxa" w:w="110"/>
-            </w:tcMar>
-          </w:tcPr>
-          <w:p>
+            <w:tcW w:type="dxa" w:w="8200"/>
+            <w:tcBorders>
+              <w:top w:val="single" w:color="D9D9D6" w:sz="4"/>
+              <w:left w:val="single" w:color="D9D9D6" w:sz="4"/>
+              <w:bottom w:val="single" w:color="D9D9D6" w:sz="4"/>
+              <w:right w:val="single" w:color="D9D9D6" w:sz="4"/>
+            </w:tcBorders>
+            <w:shd w:fill="FFFFFF" w:color="auto" w:val="clear"/>
+            <w:tcMar>
+              <w:top w:type="dxa" w:w="70"/>
+              <w:left w:type="dxa" w:w="110"/>
+              <w:bottom w:type="dxa" w:w="70"/>
+              <w:right w:type="dxa" w:w="110"/>
+            </w:tcMar>
+          </w:tcPr>
+          <w:p>
+            <w:pPr>
+              <w:keepNext/>
+            </w:pPr>
             <w:r>
               <w:rPr>
                 <w:rFonts w:ascii="Arial" w:cs="Arial" w:eastAsia="Arial" w:hAnsi="Arial"/>
@@ -322,22 +293,25 @@
         </w:trPr>
         <w:tc>
           <w:tcPr>
-            <w:tcW w:type="dxa" w:w="2600"/>
-            <w:tcBorders>
-              <w:top w:val="single" w:color="D9D9D6" w:sz="4"/>
-              <w:left w:val="single" w:color="D9D9D6" w:sz="4"/>
-              <w:bottom w:val="single" w:color="D9D9D6" w:sz="4"/>
-              <w:right w:val="single" w:color="D9D9D6" w:sz="4"/>
-            </w:tcBorders>
-            <w:shd w:fill="FFFFFF" w:color="auto" w:val="clear"/>
-            <w:tcMar>
-              <w:top w:type="dxa" w:w="70"/>
-              <w:left w:type="dxa" w:w="110"/>
-              <w:bottom w:type="dxa" w:w="70"/>
-              <w:right w:type="dxa" w:w="110"/>
-            </w:tcMar>
-          </w:tcPr>
-          <w:p>
+            <w:tcW w:type="dxa" w:w="2800"/>
+            <w:tcBorders>
+              <w:top w:val="single" w:color="D9D9D6" w:sz="4"/>
+              <w:left w:val="single" w:color="D9D9D6" w:sz="4"/>
+              <w:bottom w:val="single" w:color="D9D9D6" w:sz="4"/>
+              <w:right w:val="single" w:color="D9D9D6" w:sz="4"/>
+            </w:tcBorders>
+            <w:shd w:fill="FFFFFF" w:color="auto" w:val="clear"/>
+            <w:tcMar>
+              <w:top w:type="dxa" w:w="70"/>
+              <w:left w:type="dxa" w:w="110"/>
+              <w:bottom w:type="dxa" w:w="70"/>
+              <w:right w:type="dxa" w:w="110"/>
+            </w:tcMar>
+          </w:tcPr>
+          <w:p>
+            <w:pPr>
+              <w:keepNext w:val="false"/>
+            </w:pPr>
             <w:r>
               <w:rPr>
                 <w:rFonts w:ascii="Arial" w:cs="Arial" w:eastAsia="Arial" w:hAnsi="Arial"/>
@@ -351,22 +325,25 @@
         </w:tc>
         <w:tc>
           <w:tcPr>
-            <w:tcW w:type="dxa" w:w="6800"/>
-            <w:tcBorders>
-              <w:top w:val="single" w:color="D9D9D6" w:sz="4"/>
-              <w:left w:val="single" w:color="D9D9D6" w:sz="4"/>
-              <w:bottom w:val="single" w:color="D9D9D6" w:sz="4"/>
-              <w:right w:val="single" w:color="D9D9D6" w:sz="4"/>
-            </w:tcBorders>
-            <w:shd w:fill="FFFFFF" w:color="auto" w:val="clear"/>
-            <w:tcMar>
-              <w:top w:type="dxa" w:w="70"/>
-              <w:left w:type="dxa" w:w="110"/>
-              <w:bottom w:type="dxa" w:w="70"/>
-              <w:right w:type="dxa" w:w="110"/>
-            </w:tcMar>
-          </w:tcPr>
-          <w:p>
+            <w:tcW w:type="dxa" w:w="8200"/>
+            <w:tcBorders>
+              <w:top w:val="single" w:color="D9D9D6" w:sz="4"/>
+              <w:left w:val="single" w:color="D9D9D6" w:sz="4"/>
+              <w:bottom w:val="single" w:color="D9D9D6" w:sz="4"/>
+              <w:right w:val="single" w:color="D9D9D6" w:sz="4"/>
+            </w:tcBorders>
+            <w:shd w:fill="FFFFFF" w:color="auto" w:val="clear"/>
+            <w:tcMar>
+              <w:top w:type="dxa" w:w="70"/>
+              <w:left w:type="dxa" w:w="110"/>
+              <w:bottom w:type="dxa" w:w="70"/>
+              <w:right w:type="dxa" w:w="110"/>
+            </w:tcMar>
+          </w:tcPr>
+          <w:p>
+            <w:pPr>
+              <w:keepNext w:val="false"/>
+            </w:pPr>
             <w:r>
               <w:rPr>
                 <w:rFonts w:ascii="Arial" w:cs="Arial" w:eastAsia="Arial" w:hAnsi="Arial"/>
@@ -402,56 +379,9 @@
         <w:t xml:space="preserve">Workforce &amp; Hiring</w:t>
       </w:r>
     </w:p>
-    <w:p>
-      <w:pPr>
-        <w:keepNext w:val="false"/>
-        <w:spacing w:after="120" w:before="60"/>
-        <w:jc w:val="center"/>
-      </w:pPr>
-      <w:r>
-        <w:drawing>
-          <wp:inline distT="0" distB="0" distL="0" distR="0">
-            <wp:extent cx="6953250" cy="1552575"/>
-            <wp:effectExtent t="0" r="0" b="0" l="0"/>
-            <wp:docPr id="1" name="" descr="" title=""/>
-            <wp:cNvGraphicFramePr>
-              <a:graphicFrameLocks xmlns:a="http://schemas.openxmlformats.org/drawingml/2006/main" noChangeAspect="1"/>
-            </wp:cNvGraphicFramePr>
-            <a:graphic xmlns:a="http://schemas.openxmlformats.org/drawingml/2006/main">
-              <a:graphicData uri="http://schemas.openxmlformats.org/drawingml/2006/picture">
-                <pic:pic xmlns:pic="http://schemas.openxmlformats.org/drawingml/2006/picture">
-                  <pic:nvPicPr>
-                    <pic:cNvPr id="0" name="" descr=""/>
-                    <pic:cNvPicPr>
-                      <a:picLocks noChangeAspect="1" noChangeArrowheads="1"/>
-                    </pic:cNvPicPr>
-                  </pic:nvPicPr>
-                  <pic:blipFill>
-                    <a:blip r:embed="rId10" cstate="none"/>
-                    <a:srcRect/>
-                    <a:stretch>
-                      <a:fillRect/>
-                    </a:stretch>
-                  </pic:blipFill>
-                  <pic:spPr bwMode="auto">
-                    <a:xfrm>
-                      <a:off x="0" y="0"/>
-                      <a:ext cx="6953250" cy="1552575"/>
-                    </a:xfrm>
-                    <a:prstGeom prst="rect">
-                      <a:avLst/>
-                    </a:prstGeom>
-                  </pic:spPr>
-                </pic:pic>
-              </a:graphicData>
-            </a:graphic>
-          </wp:inline>
-        </w:drawing>
-      </w:r>
-    </w:p>
     <w:tbl>
       <w:tblPr>
-        <w:tblW w:type="dxa" w:w="9400"/>
+        <w:tblW w:type="dxa" w:w="11000"/>
         <w:tblBorders>
           <w:top w:val="single" w:color="auto" w:sz="4"/>
           <w:left w:val="single" w:color="auto" w:sz="4"/>
@@ -462,8 +392,8 @@
         </w:tblBorders>
       </w:tblPr>
       <w:tblGrid>
-        <w:gridCol w:w="2600"/>
-        <w:gridCol w:w="6800"/>
+        <w:gridCol w:w="2800"/>
+        <w:gridCol w:w="8200"/>
       </w:tblGrid>
       <w:tr>
         <w:trPr>
@@ -472,7 +402,7 @@
         </w:trPr>
         <w:tc>
           <w:tcPr>
-            <w:tcW w:type="dxa" w:w="2600"/>
+            <w:tcW w:type="dxa" w:w="2800"/>
             <w:tcBorders>
               <w:top w:val="single" w:color="D9D9D6" w:sz="4"/>
               <w:left w:val="single" w:color="D9D9D6" w:sz="4"/>
@@ -488,6 +418,9 @@
             </w:tcMar>
           </w:tcPr>
           <w:p>
+            <w:pPr>
+              <w:keepNext/>
+            </w:pPr>
             <w:r>
               <w:rPr>
                 <w:rFonts w:ascii="Arial" w:cs="Arial" w:eastAsia="Arial" w:hAnsi="Arial"/>
@@ -503,7 +436,7 @@
         </w:tc>
         <w:tc>
           <w:tcPr>
-            <w:tcW w:type="dxa" w:w="6800"/>
+            <w:tcW w:type="dxa" w:w="8200"/>
             <w:tcBorders>
               <w:top w:val="single" w:color="D9D9D6" w:sz="4"/>
               <w:left w:val="single" w:color="D9D9D6" w:sz="4"/>
@@ -519,6 +452,9 @@
             </w:tcMar>
           </w:tcPr>
           <w:p>
+            <w:pPr>
+              <w:keepNext/>
+            </w:pPr>
             <w:r>
               <w:rPr>
                 <w:rFonts w:ascii="Arial" w:cs="Arial" w:eastAsia="Arial" w:hAnsi="Arial"/>
@@ -540,22 +476,25 @@
         </w:trPr>
         <w:tc>
           <w:tcPr>
-            <w:tcW w:type="dxa" w:w="2600"/>
-            <w:tcBorders>
-              <w:top w:val="single" w:color="D9D9D6" w:sz="4"/>
-              <w:left w:val="single" w:color="D9D9D6" w:sz="4"/>
-              <w:bottom w:val="single" w:color="D9D9D6" w:sz="4"/>
-              <w:right w:val="single" w:color="D9D9D6" w:sz="4"/>
-            </w:tcBorders>
-            <w:shd w:fill="FFFFFF" w:color="auto" w:val="clear"/>
-            <w:tcMar>
-              <w:top w:type="dxa" w:w="70"/>
-              <w:left w:type="dxa" w:w="110"/>
-              <w:bottom w:type="dxa" w:w="70"/>
-              <w:right w:type="dxa" w:w="110"/>
-            </w:tcMar>
-          </w:tcPr>
-          <w:p>
+            <w:tcW w:type="dxa" w:w="2800"/>
+            <w:tcBorders>
+              <w:top w:val="single" w:color="D9D9D6" w:sz="4"/>
+              <w:left w:val="single" w:color="D9D9D6" w:sz="4"/>
+              <w:bottom w:val="single" w:color="D9D9D6" w:sz="4"/>
+              <w:right w:val="single" w:color="D9D9D6" w:sz="4"/>
+            </w:tcBorders>
+            <w:shd w:fill="FFFFFF" w:color="auto" w:val="clear"/>
+            <w:tcMar>
+              <w:top w:type="dxa" w:w="70"/>
+              <w:left w:type="dxa" w:w="110"/>
+              <w:bottom w:type="dxa" w:w="70"/>
+              <w:right w:type="dxa" w:w="110"/>
+            </w:tcMar>
+          </w:tcPr>
+          <w:p>
+            <w:pPr>
+              <w:keepNext/>
+            </w:pPr>
             <w:r>
               <w:rPr>
                 <w:rFonts w:ascii="Arial" w:cs="Arial" w:eastAsia="Arial" w:hAnsi="Arial"/>
@@ -569,22 +508,25 @@
         </w:tc>
         <w:tc>
           <w:tcPr>
-            <w:tcW w:type="dxa" w:w="6800"/>
-            <w:tcBorders>
-              <w:top w:val="single" w:color="D9D9D6" w:sz="4"/>
-              <w:left w:val="single" w:color="D9D9D6" w:sz="4"/>
-              <w:bottom w:val="single" w:color="D9D9D6" w:sz="4"/>
-              <w:right w:val="single" w:color="D9D9D6" w:sz="4"/>
-            </w:tcBorders>
-            <w:shd w:fill="FFFFFF" w:color="auto" w:val="clear"/>
-            <w:tcMar>
-              <w:top w:type="dxa" w:w="70"/>
-              <w:left w:type="dxa" w:w="110"/>
-              <w:bottom w:type="dxa" w:w="70"/>
-              <w:right w:type="dxa" w:w="110"/>
-            </w:tcMar>
-          </w:tcPr>
-          <w:p>
+            <w:tcW w:type="dxa" w:w="8200"/>
+            <w:tcBorders>
+              <w:top w:val="single" w:color="D9D9D6" w:sz="4"/>
+              <w:left w:val="single" w:color="D9D9D6" w:sz="4"/>
+              <w:bottom w:val="single" w:color="D9D9D6" w:sz="4"/>
+              <w:right w:val="single" w:color="D9D9D6" w:sz="4"/>
+            </w:tcBorders>
+            <w:shd w:fill="FFFFFF" w:color="auto" w:val="clear"/>
+            <w:tcMar>
+              <w:top w:type="dxa" w:w="70"/>
+              <w:left w:type="dxa" w:w="110"/>
+              <w:bottom w:type="dxa" w:w="70"/>
+              <w:right w:type="dxa" w:w="110"/>
+            </w:tcMar>
+          </w:tcPr>
+          <w:p>
+            <w:pPr>
+              <w:keepNext/>
+            </w:pPr>
             <w:r>
               <w:rPr>
                 <w:rFonts w:ascii="Arial" w:cs="Arial" w:eastAsia="Arial" w:hAnsi="Arial"/>
@@ -604,22 +546,25 @@
         </w:trPr>
         <w:tc>
           <w:tcPr>
-            <w:tcW w:type="dxa" w:w="2600"/>
-            <w:tcBorders>
-              <w:top w:val="single" w:color="D9D9D6" w:sz="4"/>
-              <w:left w:val="single" w:color="D9D9D6" w:sz="4"/>
-              <w:bottom w:val="single" w:color="D9D9D6" w:sz="4"/>
-              <w:right w:val="single" w:color="D9D9D6" w:sz="4"/>
-            </w:tcBorders>
-            <w:shd w:fill="FFFFFF" w:color="auto" w:val="clear"/>
-            <w:tcMar>
-              <w:top w:type="dxa" w:w="70"/>
-              <w:left w:type="dxa" w:w="110"/>
-              <w:bottom w:type="dxa" w:w="70"/>
-              <w:right w:type="dxa" w:w="110"/>
-            </w:tcMar>
-          </w:tcPr>
-          <w:p>
+            <w:tcW w:type="dxa" w:w="2800"/>
+            <w:tcBorders>
+              <w:top w:val="single" w:color="D9D9D6" w:sz="4"/>
+              <w:left w:val="single" w:color="D9D9D6" w:sz="4"/>
+              <w:bottom w:val="single" w:color="D9D9D6" w:sz="4"/>
+              <w:right w:val="single" w:color="D9D9D6" w:sz="4"/>
+            </w:tcBorders>
+            <w:shd w:fill="FFFFFF" w:color="auto" w:val="clear"/>
+            <w:tcMar>
+              <w:top w:type="dxa" w:w="70"/>
+              <w:left w:type="dxa" w:w="110"/>
+              <w:bottom w:type="dxa" w:w="70"/>
+              <w:right w:type="dxa" w:w="110"/>
+            </w:tcMar>
+          </w:tcPr>
+          <w:p>
+            <w:pPr>
+              <w:keepNext/>
+            </w:pPr>
             <w:r>
               <w:rPr>
                 <w:rFonts w:ascii="Arial" w:cs="Arial" w:eastAsia="Arial" w:hAnsi="Arial"/>
@@ -633,22 +578,25 @@
         </w:tc>
         <w:tc>
           <w:tcPr>
-            <w:tcW w:type="dxa" w:w="6800"/>
-            <w:tcBorders>
-              <w:top w:val="single" w:color="D9D9D6" w:sz="4"/>
-              <w:left w:val="single" w:color="D9D9D6" w:sz="4"/>
-              <w:bottom w:val="single" w:color="D9D9D6" w:sz="4"/>
-              <w:right w:val="single" w:color="D9D9D6" w:sz="4"/>
-            </w:tcBorders>
-            <w:shd w:fill="FFFFFF" w:color="auto" w:val="clear"/>
-            <w:tcMar>
-              <w:top w:type="dxa" w:w="70"/>
-              <w:left w:type="dxa" w:w="110"/>
-              <w:bottom w:type="dxa" w:w="70"/>
-              <w:right w:type="dxa" w:w="110"/>
-            </w:tcMar>
-          </w:tcPr>
-          <w:p>
+            <w:tcW w:type="dxa" w:w="8200"/>
+            <w:tcBorders>
+              <w:top w:val="single" w:color="D9D9D6" w:sz="4"/>
+              <w:left w:val="single" w:color="D9D9D6" w:sz="4"/>
+              <w:bottom w:val="single" w:color="D9D9D6" w:sz="4"/>
+              <w:right w:val="single" w:color="D9D9D6" w:sz="4"/>
+            </w:tcBorders>
+            <w:shd w:fill="FFFFFF" w:color="auto" w:val="clear"/>
+            <w:tcMar>
+              <w:top w:type="dxa" w:w="70"/>
+              <w:left w:type="dxa" w:w="110"/>
+              <w:bottom w:type="dxa" w:w="70"/>
+              <w:right w:type="dxa" w:w="110"/>
+            </w:tcMar>
+          </w:tcPr>
+          <w:p>
+            <w:pPr>
+              <w:keepNext/>
+            </w:pPr>
             <w:r>
               <w:rPr>
                 <w:rFonts w:ascii="Arial" w:cs="Arial" w:eastAsia="Arial" w:hAnsi="Arial"/>
@@ -668,22 +616,25 @@
         </w:trPr>
         <w:tc>
           <w:tcPr>
-            <w:tcW w:type="dxa" w:w="2600"/>
-            <w:tcBorders>
-              <w:top w:val="single" w:color="D9D9D6" w:sz="4"/>
-              <w:left w:val="single" w:color="D9D9D6" w:sz="4"/>
-              <w:bottom w:val="single" w:color="D9D9D6" w:sz="4"/>
-              <w:right w:val="single" w:color="D9D9D6" w:sz="4"/>
-            </w:tcBorders>
-            <w:shd w:fill="FFFFFF" w:color="auto" w:val="clear"/>
-            <w:tcMar>
-              <w:top w:type="dxa" w:w="70"/>
-              <w:left w:type="dxa" w:w="110"/>
-              <w:bottom w:type="dxa" w:w="70"/>
-              <w:right w:type="dxa" w:w="110"/>
-            </w:tcMar>
-          </w:tcPr>
-          <w:p>
+            <w:tcW w:type="dxa" w:w="2800"/>
+            <w:tcBorders>
+              <w:top w:val="single" w:color="D9D9D6" w:sz="4"/>
+              <w:left w:val="single" w:color="D9D9D6" w:sz="4"/>
+              <w:bottom w:val="single" w:color="D9D9D6" w:sz="4"/>
+              <w:right w:val="single" w:color="D9D9D6" w:sz="4"/>
+            </w:tcBorders>
+            <w:shd w:fill="FFFFFF" w:color="auto" w:val="clear"/>
+            <w:tcMar>
+              <w:top w:type="dxa" w:w="70"/>
+              <w:left w:type="dxa" w:w="110"/>
+              <w:bottom w:type="dxa" w:w="70"/>
+              <w:right w:type="dxa" w:w="110"/>
+            </w:tcMar>
+          </w:tcPr>
+          <w:p>
+            <w:pPr>
+              <w:keepNext/>
+            </w:pPr>
             <w:r>
               <w:rPr>
                 <w:rFonts w:ascii="Arial" w:cs="Arial" w:eastAsia="Arial" w:hAnsi="Arial"/>
@@ -697,22 +648,25 @@
         </w:tc>
         <w:tc>
           <w:tcPr>
-            <w:tcW w:type="dxa" w:w="6800"/>
-            <w:tcBorders>
-              <w:top w:val="single" w:color="D9D9D6" w:sz="4"/>
-              <w:left w:val="single" w:color="D9D9D6" w:sz="4"/>
-              <w:bottom w:val="single" w:color="D9D9D6" w:sz="4"/>
-              <w:right w:val="single" w:color="D9D9D6" w:sz="4"/>
-            </w:tcBorders>
-            <w:shd w:fill="FFFFFF" w:color="auto" w:val="clear"/>
-            <w:tcMar>
-              <w:top w:type="dxa" w:w="70"/>
-              <w:left w:type="dxa" w:w="110"/>
-              <w:bottom w:type="dxa" w:w="70"/>
-              <w:right w:type="dxa" w:w="110"/>
-            </w:tcMar>
-          </w:tcPr>
-          <w:p>
+            <w:tcW w:type="dxa" w:w="8200"/>
+            <w:tcBorders>
+              <w:top w:val="single" w:color="D9D9D6" w:sz="4"/>
+              <w:left w:val="single" w:color="D9D9D6" w:sz="4"/>
+              <w:bottom w:val="single" w:color="D9D9D6" w:sz="4"/>
+              <w:right w:val="single" w:color="D9D9D6" w:sz="4"/>
+            </w:tcBorders>
+            <w:shd w:fill="FFFFFF" w:color="auto" w:val="clear"/>
+            <w:tcMar>
+              <w:top w:type="dxa" w:w="70"/>
+              <w:left w:type="dxa" w:w="110"/>
+              <w:bottom w:type="dxa" w:w="70"/>
+              <w:right w:type="dxa" w:w="110"/>
+            </w:tcMar>
+          </w:tcPr>
+          <w:p>
+            <w:pPr>
+              <w:keepNext/>
+            </w:pPr>
             <w:r>
               <w:rPr>
                 <w:rFonts w:ascii="Arial" w:cs="Arial" w:eastAsia="Arial" w:hAnsi="Arial"/>
@@ -732,22 +686,25 @@
         </w:trPr>
         <w:tc>
           <w:tcPr>
-            <w:tcW w:type="dxa" w:w="2600"/>
-            <w:tcBorders>
-              <w:top w:val="single" w:color="D9D9D6" w:sz="4"/>
-              <w:left w:val="single" w:color="D9D9D6" w:sz="4"/>
-              <w:bottom w:val="single" w:color="D9D9D6" w:sz="4"/>
-              <w:right w:val="single" w:color="D9D9D6" w:sz="4"/>
-            </w:tcBorders>
-            <w:shd w:fill="FFFFFF" w:color="auto" w:val="clear"/>
-            <w:tcMar>
-              <w:top w:type="dxa" w:w="70"/>
-              <w:left w:type="dxa" w:w="110"/>
-              <w:bottom w:type="dxa" w:w="70"/>
-              <w:right w:type="dxa" w:w="110"/>
-            </w:tcMar>
-          </w:tcPr>
-          <w:p>
+            <w:tcW w:type="dxa" w:w="2800"/>
+            <w:tcBorders>
+              <w:top w:val="single" w:color="D9D9D6" w:sz="4"/>
+              <w:left w:val="single" w:color="D9D9D6" w:sz="4"/>
+              <w:bottom w:val="single" w:color="D9D9D6" w:sz="4"/>
+              <w:right w:val="single" w:color="D9D9D6" w:sz="4"/>
+            </w:tcBorders>
+            <w:shd w:fill="FFFFFF" w:color="auto" w:val="clear"/>
+            <w:tcMar>
+              <w:top w:type="dxa" w:w="70"/>
+              <w:left w:type="dxa" w:w="110"/>
+              <w:bottom w:type="dxa" w:w="70"/>
+              <w:right w:type="dxa" w:w="110"/>
+            </w:tcMar>
+          </w:tcPr>
+          <w:p>
+            <w:pPr>
+              <w:keepNext w:val="false"/>
+            </w:pPr>
             <w:r>
               <w:rPr>
                 <w:rFonts w:ascii="Arial" w:cs="Arial" w:eastAsia="Arial" w:hAnsi="Arial"/>
@@ -761,22 +718,25 @@
         </w:tc>
         <w:tc>
           <w:tcPr>
-            <w:tcW w:type="dxa" w:w="6800"/>
-            <w:tcBorders>
-              <w:top w:val="single" w:color="D9D9D6" w:sz="4"/>
-              <w:left w:val="single" w:color="D9D9D6" w:sz="4"/>
-              <w:bottom w:val="single" w:color="D9D9D6" w:sz="4"/>
-              <w:right w:val="single" w:color="D9D9D6" w:sz="4"/>
-            </w:tcBorders>
-            <w:shd w:fill="FFFFFF" w:color="auto" w:val="clear"/>
-            <w:tcMar>
-              <w:top w:type="dxa" w:w="70"/>
-              <w:left w:type="dxa" w:w="110"/>
-              <w:bottom w:type="dxa" w:w="70"/>
-              <w:right w:type="dxa" w:w="110"/>
-            </w:tcMar>
-          </w:tcPr>
-          <w:p>
+            <w:tcW w:type="dxa" w:w="8200"/>
+            <w:tcBorders>
+              <w:top w:val="single" w:color="D9D9D6" w:sz="4"/>
+              <w:left w:val="single" w:color="D9D9D6" w:sz="4"/>
+              <w:bottom w:val="single" w:color="D9D9D6" w:sz="4"/>
+              <w:right w:val="single" w:color="D9D9D6" w:sz="4"/>
+            </w:tcBorders>
+            <w:shd w:fill="FFFFFF" w:color="auto" w:val="clear"/>
+            <w:tcMar>
+              <w:top w:type="dxa" w:w="70"/>
+              <w:left w:type="dxa" w:w="110"/>
+              <w:bottom w:type="dxa" w:w="70"/>
+              <w:right w:type="dxa" w:w="110"/>
+            </w:tcMar>
+          </w:tcPr>
+          <w:p>
+            <w:pPr>
+              <w:keepNext w:val="false"/>
+            </w:pPr>
             <w:r>
               <w:rPr>
                 <w:rFonts w:ascii="Arial" w:cs="Arial" w:eastAsia="Arial" w:hAnsi="Arial"/>
@@ -812,56 +772,9 @@
         <w:t xml:space="preserve">Turnover</w:t>
       </w:r>
     </w:p>
-    <w:p>
-      <w:pPr>
-        <w:keepNext w:val="false"/>
-        <w:spacing w:after="120" w:before="60"/>
-        <w:jc w:val="center"/>
-      </w:pPr>
-      <w:r>
-        <w:drawing>
-          <wp:inline distT="0" distB="0" distL="0" distR="0">
-            <wp:extent cx="6953250" cy="1657350"/>
-            <wp:effectExtent t="0" r="0" b="0" l="0"/>
-            <wp:docPr id="1" name="" descr="" title=""/>
-            <wp:cNvGraphicFramePr>
-              <a:graphicFrameLocks xmlns:a="http://schemas.openxmlformats.org/drawingml/2006/main" noChangeAspect="1"/>
-            </wp:cNvGraphicFramePr>
-            <a:graphic xmlns:a="http://schemas.openxmlformats.org/drawingml/2006/main">
-              <a:graphicData uri="http://schemas.openxmlformats.org/drawingml/2006/picture">
-                <pic:pic xmlns:pic="http://schemas.openxmlformats.org/drawingml/2006/picture">
-                  <pic:nvPicPr>
-                    <pic:cNvPr id="0" name="" descr=""/>
-                    <pic:cNvPicPr>
-                      <a:picLocks noChangeAspect="1" noChangeArrowheads="1"/>
-                    </pic:cNvPicPr>
-                  </pic:nvPicPr>
-                  <pic:blipFill>
-                    <a:blip r:embed="rId11" cstate="none"/>
-                    <a:srcRect/>
-                    <a:stretch>
-                      <a:fillRect/>
-                    </a:stretch>
-                  </pic:blipFill>
-                  <pic:spPr bwMode="auto">
-                    <a:xfrm>
-                      <a:off x="0" y="0"/>
-                      <a:ext cx="6953250" cy="1657350"/>
-                    </a:xfrm>
-                    <a:prstGeom prst="rect">
-                      <a:avLst/>
-                    </a:prstGeom>
-                  </pic:spPr>
-                </pic:pic>
-              </a:graphicData>
-            </a:graphic>
-          </wp:inline>
-        </w:drawing>
-      </w:r>
-    </w:p>
     <w:tbl>
       <w:tblPr>
-        <w:tblW w:type="dxa" w:w="9400"/>
+        <w:tblW w:type="dxa" w:w="11000"/>
         <w:tblBorders>
           <w:top w:val="single" w:color="auto" w:sz="4"/>
           <w:left w:val="single" w:color="auto" w:sz="4"/>
@@ -872,8 +785,8 @@
         </w:tblBorders>
       </w:tblPr>
       <w:tblGrid>
-        <w:gridCol w:w="2600"/>
-        <w:gridCol w:w="6800"/>
+        <w:gridCol w:w="2800"/>
+        <w:gridCol w:w="8200"/>
       </w:tblGrid>
       <w:tr>
         <w:trPr>
@@ -882,7 +795,7 @@
         </w:trPr>
         <w:tc>
           <w:tcPr>
-            <w:tcW w:type="dxa" w:w="2600"/>
+            <w:tcW w:type="dxa" w:w="2800"/>
             <w:tcBorders>
               <w:top w:val="single" w:color="D9D9D6" w:sz="4"/>
               <w:left w:val="single" w:color="D9D9D6" w:sz="4"/>
@@ -898,6 +811,9 @@
             </w:tcMar>
           </w:tcPr>
           <w:p>
+            <w:pPr>
+              <w:keepNext/>
+            </w:pPr>
             <w:r>
               <w:rPr>
                 <w:rFonts w:ascii="Arial" w:cs="Arial" w:eastAsia="Arial" w:hAnsi="Arial"/>
@@ -913,7 +829,7 @@
         </w:tc>
         <w:tc>
           <w:tcPr>
-            <w:tcW w:type="dxa" w:w="6800"/>
+            <w:tcW w:type="dxa" w:w="8200"/>
             <w:tcBorders>
               <w:top w:val="single" w:color="D9D9D6" w:sz="4"/>
               <w:left w:val="single" w:color="D9D9D6" w:sz="4"/>
@@ -929,6 +845,9 @@
             </w:tcMar>
           </w:tcPr>
           <w:p>
+            <w:pPr>
+              <w:keepNext/>
+            </w:pPr>
             <w:r>
               <w:rPr>
                 <w:rFonts w:ascii="Arial" w:cs="Arial" w:eastAsia="Arial" w:hAnsi="Arial"/>
@@ -950,22 +869,25 @@
         </w:trPr>
         <w:tc>
           <w:tcPr>
-            <w:tcW w:type="dxa" w:w="2600"/>
-            <w:tcBorders>
-              <w:top w:val="single" w:color="D9D9D6" w:sz="4"/>
-              <w:left w:val="single" w:color="D9D9D6" w:sz="4"/>
-              <w:bottom w:val="single" w:color="D9D9D6" w:sz="4"/>
-              <w:right w:val="single" w:color="D9D9D6" w:sz="4"/>
-            </w:tcBorders>
-            <w:shd w:fill="FFFFFF" w:color="auto" w:val="clear"/>
-            <w:tcMar>
-              <w:top w:type="dxa" w:w="70"/>
-              <w:left w:type="dxa" w:w="110"/>
-              <w:bottom w:type="dxa" w:w="70"/>
-              <w:right w:type="dxa" w:w="110"/>
-            </w:tcMar>
-          </w:tcPr>
-          <w:p>
+            <w:tcW w:type="dxa" w:w="2800"/>
+            <w:tcBorders>
+              <w:top w:val="single" w:color="D9D9D6" w:sz="4"/>
+              <w:left w:val="single" w:color="D9D9D6" w:sz="4"/>
+              <w:bottom w:val="single" w:color="D9D9D6" w:sz="4"/>
+              <w:right w:val="single" w:color="D9D9D6" w:sz="4"/>
+            </w:tcBorders>
+            <w:shd w:fill="FFFFFF" w:color="auto" w:val="clear"/>
+            <w:tcMar>
+              <w:top w:type="dxa" w:w="70"/>
+              <w:left w:type="dxa" w:w="110"/>
+              <w:bottom w:type="dxa" w:w="70"/>
+              <w:right w:type="dxa" w:w="110"/>
+            </w:tcMar>
+          </w:tcPr>
+          <w:p>
+            <w:pPr>
+              <w:keepNext/>
+            </w:pPr>
             <w:r>
               <w:rPr>
                 <w:rFonts w:ascii="Arial" w:cs="Arial" w:eastAsia="Arial" w:hAnsi="Arial"/>
@@ -979,22 +901,25 @@
         </w:tc>
         <w:tc>
           <w:tcPr>
-            <w:tcW w:type="dxa" w:w="6800"/>
-            <w:tcBorders>
-              <w:top w:val="single" w:color="D9D9D6" w:sz="4"/>
-              <w:left w:val="single" w:color="D9D9D6" w:sz="4"/>
-              <w:bottom w:val="single" w:color="D9D9D6" w:sz="4"/>
-              <w:right w:val="single" w:color="D9D9D6" w:sz="4"/>
-            </w:tcBorders>
-            <w:shd w:fill="FFFFFF" w:color="auto" w:val="clear"/>
-            <w:tcMar>
-              <w:top w:type="dxa" w:w="70"/>
-              <w:left w:type="dxa" w:w="110"/>
-              <w:bottom w:type="dxa" w:w="70"/>
-              <w:right w:type="dxa" w:w="110"/>
-            </w:tcMar>
-          </w:tcPr>
-          <w:p>
+            <w:tcW w:type="dxa" w:w="8200"/>
+            <w:tcBorders>
+              <w:top w:val="single" w:color="D9D9D6" w:sz="4"/>
+              <w:left w:val="single" w:color="D9D9D6" w:sz="4"/>
+              <w:bottom w:val="single" w:color="D9D9D6" w:sz="4"/>
+              <w:right w:val="single" w:color="D9D9D6" w:sz="4"/>
+            </w:tcBorders>
+            <w:shd w:fill="FFFFFF" w:color="auto" w:val="clear"/>
+            <w:tcMar>
+              <w:top w:type="dxa" w:w="70"/>
+              <w:left w:type="dxa" w:w="110"/>
+              <w:bottom w:type="dxa" w:w="70"/>
+              <w:right w:type="dxa" w:w="110"/>
+            </w:tcMar>
+          </w:tcPr>
+          <w:p>
+            <w:pPr>
+              <w:keepNext/>
+            </w:pPr>
             <w:r>
               <w:rPr>
                 <w:rFonts w:ascii="Arial" w:cs="Arial" w:eastAsia="Arial" w:hAnsi="Arial"/>
@@ -1014,22 +939,25 @@
         </w:trPr>
         <w:tc>
           <w:tcPr>
-            <w:tcW w:type="dxa" w:w="2600"/>
-            <w:tcBorders>
-              <w:top w:val="single" w:color="D9D9D6" w:sz="4"/>
-              <w:left w:val="single" w:color="D9D9D6" w:sz="4"/>
-              <w:bottom w:val="single" w:color="D9D9D6" w:sz="4"/>
-              <w:right w:val="single" w:color="D9D9D6" w:sz="4"/>
-            </w:tcBorders>
-            <w:shd w:fill="FFFFFF" w:color="auto" w:val="clear"/>
-            <w:tcMar>
-              <w:top w:type="dxa" w:w="70"/>
-              <w:left w:type="dxa" w:w="110"/>
-              <w:bottom w:type="dxa" w:w="70"/>
-              <w:right w:type="dxa" w:w="110"/>
-            </w:tcMar>
-          </w:tcPr>
-          <w:p>
+            <w:tcW w:type="dxa" w:w="2800"/>
+            <w:tcBorders>
+              <w:top w:val="single" w:color="D9D9D6" w:sz="4"/>
+              <w:left w:val="single" w:color="D9D9D6" w:sz="4"/>
+              <w:bottom w:val="single" w:color="D9D9D6" w:sz="4"/>
+              <w:right w:val="single" w:color="D9D9D6" w:sz="4"/>
+            </w:tcBorders>
+            <w:shd w:fill="FFFFFF" w:color="auto" w:val="clear"/>
+            <w:tcMar>
+              <w:top w:type="dxa" w:w="70"/>
+              <w:left w:type="dxa" w:w="110"/>
+              <w:bottom w:type="dxa" w:w="70"/>
+              <w:right w:type="dxa" w:w="110"/>
+            </w:tcMar>
+          </w:tcPr>
+          <w:p>
+            <w:pPr>
+              <w:keepNext/>
+            </w:pPr>
             <w:r>
               <w:rPr>
                 <w:rFonts w:ascii="Arial" w:cs="Arial" w:eastAsia="Arial" w:hAnsi="Arial"/>
@@ -1043,22 +971,25 @@
         </w:tc>
         <w:tc>
           <w:tcPr>
-            <w:tcW w:type="dxa" w:w="6800"/>
-            <w:tcBorders>
-              <w:top w:val="single" w:color="D9D9D6" w:sz="4"/>
-              <w:left w:val="single" w:color="D9D9D6" w:sz="4"/>
-              <w:bottom w:val="single" w:color="D9D9D6" w:sz="4"/>
-              <w:right w:val="single" w:color="D9D9D6" w:sz="4"/>
-            </w:tcBorders>
-            <w:shd w:fill="FFFFFF" w:color="auto" w:val="clear"/>
-            <w:tcMar>
-              <w:top w:type="dxa" w:w="70"/>
-              <w:left w:type="dxa" w:w="110"/>
-              <w:bottom w:type="dxa" w:w="70"/>
-              <w:right w:type="dxa" w:w="110"/>
-            </w:tcMar>
-          </w:tcPr>
-          <w:p>
+            <w:tcW w:type="dxa" w:w="8200"/>
+            <w:tcBorders>
+              <w:top w:val="single" w:color="D9D9D6" w:sz="4"/>
+              <w:left w:val="single" w:color="D9D9D6" w:sz="4"/>
+              <w:bottom w:val="single" w:color="D9D9D6" w:sz="4"/>
+              <w:right w:val="single" w:color="D9D9D6" w:sz="4"/>
+            </w:tcBorders>
+            <w:shd w:fill="FFFFFF" w:color="auto" w:val="clear"/>
+            <w:tcMar>
+              <w:top w:type="dxa" w:w="70"/>
+              <w:left w:type="dxa" w:w="110"/>
+              <w:bottom w:type="dxa" w:w="70"/>
+              <w:right w:type="dxa" w:w="110"/>
+            </w:tcMar>
+          </w:tcPr>
+          <w:p>
+            <w:pPr>
+              <w:keepNext/>
+            </w:pPr>
             <w:r>
               <w:rPr>
                 <w:rFonts w:ascii="Arial" w:cs="Arial" w:eastAsia="Arial" w:hAnsi="Arial"/>
@@ -1078,22 +1009,25 @@
         </w:trPr>
         <w:tc>
           <w:tcPr>
-            <w:tcW w:type="dxa" w:w="2600"/>
-            <w:tcBorders>
-              <w:top w:val="single" w:color="D9D9D6" w:sz="4"/>
-              <w:left w:val="single" w:color="D9D9D6" w:sz="4"/>
-              <w:bottom w:val="single" w:color="D9D9D6" w:sz="4"/>
-              <w:right w:val="single" w:color="D9D9D6" w:sz="4"/>
-            </w:tcBorders>
-            <w:shd w:fill="FFFFFF" w:color="auto" w:val="clear"/>
-            <w:tcMar>
-              <w:top w:type="dxa" w:w="70"/>
-              <w:left w:type="dxa" w:w="110"/>
-              <w:bottom w:type="dxa" w:w="70"/>
-              <w:right w:type="dxa" w:w="110"/>
-            </w:tcMar>
-          </w:tcPr>
-          <w:p>
+            <w:tcW w:type="dxa" w:w="2800"/>
+            <w:tcBorders>
+              <w:top w:val="single" w:color="D9D9D6" w:sz="4"/>
+              <w:left w:val="single" w:color="D9D9D6" w:sz="4"/>
+              <w:bottom w:val="single" w:color="D9D9D6" w:sz="4"/>
+              <w:right w:val="single" w:color="D9D9D6" w:sz="4"/>
+            </w:tcBorders>
+            <w:shd w:fill="FFFFFF" w:color="auto" w:val="clear"/>
+            <w:tcMar>
+              <w:top w:type="dxa" w:w="70"/>
+              <w:left w:type="dxa" w:w="110"/>
+              <w:bottom w:type="dxa" w:w="70"/>
+              <w:right w:type="dxa" w:w="110"/>
+            </w:tcMar>
+          </w:tcPr>
+          <w:p>
+            <w:pPr>
+              <w:keepNext/>
+            </w:pPr>
             <w:r>
               <w:rPr>
                 <w:rFonts w:ascii="Arial" w:cs="Arial" w:eastAsia="Arial" w:hAnsi="Arial"/>
@@ -1107,22 +1041,25 @@
         </w:tc>
         <w:tc>
           <w:tcPr>
-            <w:tcW w:type="dxa" w:w="6800"/>
-            <w:tcBorders>
-              <w:top w:val="single" w:color="D9D9D6" w:sz="4"/>
-              <w:left w:val="single" w:color="D9D9D6" w:sz="4"/>
-              <w:bottom w:val="single" w:color="D9D9D6" w:sz="4"/>
-              <w:right w:val="single" w:color="D9D9D6" w:sz="4"/>
-            </w:tcBorders>
-            <w:shd w:fill="FFFFFF" w:color="auto" w:val="clear"/>
-            <w:tcMar>
-              <w:top w:type="dxa" w:w="70"/>
-              <w:left w:type="dxa" w:w="110"/>
-              <w:bottom w:type="dxa" w:w="70"/>
-              <w:right w:type="dxa" w:w="110"/>
-            </w:tcMar>
-          </w:tcPr>
-          <w:p>
+            <w:tcW w:type="dxa" w:w="8200"/>
+            <w:tcBorders>
+              <w:top w:val="single" w:color="D9D9D6" w:sz="4"/>
+              <w:left w:val="single" w:color="D9D9D6" w:sz="4"/>
+              <w:bottom w:val="single" w:color="D9D9D6" w:sz="4"/>
+              <w:right w:val="single" w:color="D9D9D6" w:sz="4"/>
+            </w:tcBorders>
+            <w:shd w:fill="FFFFFF" w:color="auto" w:val="clear"/>
+            <w:tcMar>
+              <w:top w:type="dxa" w:w="70"/>
+              <w:left w:type="dxa" w:w="110"/>
+              <w:bottom w:type="dxa" w:w="70"/>
+              <w:right w:type="dxa" w:w="110"/>
+            </w:tcMar>
+          </w:tcPr>
+          <w:p>
+            <w:pPr>
+              <w:keepNext/>
+            </w:pPr>
             <w:r>
               <w:rPr>
                 <w:rFonts w:ascii="Arial" w:cs="Arial" w:eastAsia="Arial" w:hAnsi="Arial"/>
@@ -1142,22 +1079,25 @@
         </w:trPr>
         <w:tc>
           <w:tcPr>
-            <w:tcW w:type="dxa" w:w="2600"/>
-            <w:tcBorders>
-              <w:top w:val="single" w:color="D9D9D6" w:sz="4"/>
-              <w:left w:val="single" w:color="D9D9D6" w:sz="4"/>
-              <w:bottom w:val="single" w:color="D9D9D6" w:sz="4"/>
-              <w:right w:val="single" w:color="D9D9D6" w:sz="4"/>
-            </w:tcBorders>
-            <w:shd w:fill="FFFFFF" w:color="auto" w:val="clear"/>
-            <w:tcMar>
-              <w:top w:type="dxa" w:w="70"/>
-              <w:left w:type="dxa" w:w="110"/>
-              <w:bottom w:type="dxa" w:w="70"/>
-              <w:right w:type="dxa" w:w="110"/>
-            </w:tcMar>
-          </w:tcPr>
-          <w:p>
+            <w:tcW w:type="dxa" w:w="2800"/>
+            <w:tcBorders>
+              <w:top w:val="single" w:color="D9D9D6" w:sz="4"/>
+              <w:left w:val="single" w:color="D9D9D6" w:sz="4"/>
+              <w:bottom w:val="single" w:color="D9D9D6" w:sz="4"/>
+              <w:right w:val="single" w:color="D9D9D6" w:sz="4"/>
+            </w:tcBorders>
+            <w:shd w:fill="FFFFFF" w:color="auto" w:val="clear"/>
+            <w:tcMar>
+              <w:top w:type="dxa" w:w="70"/>
+              <w:left w:type="dxa" w:w="110"/>
+              <w:bottom w:type="dxa" w:w="70"/>
+              <w:right w:type="dxa" w:w="110"/>
+            </w:tcMar>
+          </w:tcPr>
+          <w:p>
+            <w:pPr>
+              <w:keepNext w:val="false"/>
+            </w:pPr>
             <w:r>
               <w:rPr>
                 <w:rFonts w:ascii="Arial" w:cs="Arial" w:eastAsia="Arial" w:hAnsi="Arial"/>
@@ -1171,22 +1111,25 @@
         </w:tc>
         <w:tc>
           <w:tcPr>
-            <w:tcW w:type="dxa" w:w="6800"/>
-            <w:tcBorders>
-              <w:top w:val="single" w:color="D9D9D6" w:sz="4"/>
-              <w:left w:val="single" w:color="D9D9D6" w:sz="4"/>
-              <w:bottom w:val="single" w:color="D9D9D6" w:sz="4"/>
-              <w:right w:val="single" w:color="D9D9D6" w:sz="4"/>
-            </w:tcBorders>
-            <w:shd w:fill="FFFFFF" w:color="auto" w:val="clear"/>
-            <w:tcMar>
-              <w:top w:type="dxa" w:w="70"/>
-              <w:left w:type="dxa" w:w="110"/>
-              <w:bottom w:type="dxa" w:w="70"/>
-              <w:right w:type="dxa" w:w="110"/>
-            </w:tcMar>
-          </w:tcPr>
-          <w:p>
+            <w:tcW w:type="dxa" w:w="8200"/>
+            <w:tcBorders>
+              <w:top w:val="single" w:color="D9D9D6" w:sz="4"/>
+              <w:left w:val="single" w:color="D9D9D6" w:sz="4"/>
+              <w:bottom w:val="single" w:color="D9D9D6" w:sz="4"/>
+              <w:right w:val="single" w:color="D9D9D6" w:sz="4"/>
+            </w:tcBorders>
+            <w:shd w:fill="FFFFFF" w:color="auto" w:val="clear"/>
+            <w:tcMar>
+              <w:top w:type="dxa" w:w="70"/>
+              <w:left w:type="dxa" w:w="110"/>
+              <w:bottom w:type="dxa" w:w="70"/>
+              <w:right w:type="dxa" w:w="110"/>
+            </w:tcMar>
+          </w:tcPr>
+          <w:p>
+            <w:pPr>
+              <w:keepNext w:val="false"/>
+            </w:pPr>
             <w:r>
               <w:rPr>
                 <w:rFonts w:ascii="Arial" w:cs="Arial" w:eastAsia="Arial" w:hAnsi="Arial"/>
@@ -1222,56 +1165,9 @@
         <w:t xml:space="preserve">Comparison</w:t>
       </w:r>
     </w:p>
-    <w:p>
-      <w:pPr>
-        <w:keepNext w:val="false"/>
-        <w:spacing w:after="120" w:before="60"/>
-        <w:jc w:val="center"/>
-      </w:pPr>
-      <w:r>
-        <w:drawing>
-          <wp:inline distT="0" distB="0" distL="0" distR="0">
-            <wp:extent cx="6953250" cy="733425"/>
-            <wp:effectExtent t="0" r="0" b="0" l="0"/>
-            <wp:docPr id="1" name="" descr="" title=""/>
-            <wp:cNvGraphicFramePr>
-              <a:graphicFrameLocks xmlns:a="http://schemas.openxmlformats.org/drawingml/2006/main" noChangeAspect="1"/>
-            </wp:cNvGraphicFramePr>
-            <a:graphic xmlns:a="http://schemas.openxmlformats.org/drawingml/2006/main">
-              <a:graphicData uri="http://schemas.openxmlformats.org/drawingml/2006/picture">
-                <pic:pic xmlns:pic="http://schemas.openxmlformats.org/drawingml/2006/picture">
-                  <pic:nvPicPr>
-                    <pic:cNvPr id="0" name="" descr=""/>
-                    <pic:cNvPicPr>
-                      <a:picLocks noChangeAspect="1" noChangeArrowheads="1"/>
-                    </pic:cNvPicPr>
-                  </pic:nvPicPr>
-                  <pic:blipFill>
-                    <a:blip r:embed="rId12" cstate="none"/>
-                    <a:srcRect/>
-                    <a:stretch>
-                      <a:fillRect/>
-                    </a:stretch>
-                  </pic:blipFill>
-                  <pic:spPr bwMode="auto">
-                    <a:xfrm>
-                      <a:off x="0" y="0"/>
-                      <a:ext cx="6953250" cy="733425"/>
-                    </a:xfrm>
-                    <a:prstGeom prst="rect">
-                      <a:avLst/>
-                    </a:prstGeom>
-                  </pic:spPr>
-                </pic:pic>
-              </a:graphicData>
-            </a:graphic>
-          </wp:inline>
-        </w:drawing>
-      </w:r>
-    </w:p>
     <w:tbl>
       <w:tblPr>
-        <w:tblW w:type="dxa" w:w="9400"/>
+        <w:tblW w:type="dxa" w:w="11000"/>
         <w:tblBorders>
           <w:top w:val="single" w:color="auto" w:sz="4"/>
           <w:left w:val="single" w:color="auto" w:sz="4"/>
@@ -1282,8 +1178,8 @@
         </w:tblBorders>
       </w:tblPr>
       <w:tblGrid>
-        <w:gridCol w:w="2600"/>
-        <w:gridCol w:w="6800"/>
+        <w:gridCol w:w="2800"/>
+        <w:gridCol w:w="8200"/>
       </w:tblGrid>
       <w:tr>
         <w:trPr>
@@ -1292,7 +1188,7 @@
         </w:trPr>
         <w:tc>
           <w:tcPr>
-            <w:tcW w:type="dxa" w:w="2600"/>
+            <w:tcW w:type="dxa" w:w="2800"/>
             <w:tcBorders>
               <w:top w:val="single" w:color="D9D9D6" w:sz="4"/>
               <w:left w:val="single" w:color="D9D9D6" w:sz="4"/>
@@ -1308,6 +1204,9 @@
             </w:tcMar>
           </w:tcPr>
           <w:p>
+            <w:pPr>
+              <w:keepNext/>
+            </w:pPr>
             <w:r>
               <w:rPr>
                 <w:rFonts w:ascii="Arial" w:cs="Arial" w:eastAsia="Arial" w:hAnsi="Arial"/>
@@ -1323,7 +1222,7 @@
         </w:tc>
         <w:tc>
           <w:tcPr>
-            <w:tcW w:type="dxa" w:w="6800"/>
+            <w:tcW w:type="dxa" w:w="8200"/>
             <w:tcBorders>
               <w:top w:val="single" w:color="D9D9D6" w:sz="4"/>
               <w:left w:val="single" w:color="D9D9D6" w:sz="4"/>
@@ -1339,6 +1238,9 @@
             </w:tcMar>
           </w:tcPr>
           <w:p>
+            <w:pPr>
+              <w:keepNext/>
+            </w:pPr>
             <w:r>
               <w:rPr>
                 <w:rFonts w:ascii="Arial" w:cs="Arial" w:eastAsia="Arial" w:hAnsi="Arial"/>
@@ -1360,22 +1262,25 @@
         </w:trPr>
         <w:tc>
           <w:tcPr>
-            <w:tcW w:type="dxa" w:w="2600"/>
-            <w:tcBorders>
-              <w:top w:val="single" w:color="D9D9D6" w:sz="4"/>
-              <w:left w:val="single" w:color="D9D9D6" w:sz="4"/>
-              <w:bottom w:val="single" w:color="D9D9D6" w:sz="4"/>
-              <w:right w:val="single" w:color="D9D9D6" w:sz="4"/>
-            </w:tcBorders>
-            <w:shd w:fill="FFFFFF" w:color="auto" w:val="clear"/>
-            <w:tcMar>
-              <w:top w:type="dxa" w:w="70"/>
-              <w:left w:type="dxa" w:w="110"/>
-              <w:bottom w:type="dxa" w:w="70"/>
-              <w:right w:type="dxa" w:w="110"/>
-            </w:tcMar>
-          </w:tcPr>
-          <w:p>
+            <w:tcW w:type="dxa" w:w="2800"/>
+            <w:tcBorders>
+              <w:top w:val="single" w:color="D9D9D6" w:sz="4"/>
+              <w:left w:val="single" w:color="D9D9D6" w:sz="4"/>
+              <w:bottom w:val="single" w:color="D9D9D6" w:sz="4"/>
+              <w:right w:val="single" w:color="D9D9D6" w:sz="4"/>
+            </w:tcBorders>
+            <w:shd w:fill="FFFFFF" w:color="auto" w:val="clear"/>
+            <w:tcMar>
+              <w:top w:type="dxa" w:w="70"/>
+              <w:left w:type="dxa" w:w="110"/>
+              <w:bottom w:type="dxa" w:w="70"/>
+              <w:right w:type="dxa" w:w="110"/>
+            </w:tcMar>
+          </w:tcPr>
+          <w:p>
+            <w:pPr>
+              <w:keepNext/>
+            </w:pPr>
             <w:r>
               <w:rPr>
                 <w:rFonts w:ascii="Arial" w:cs="Arial" w:eastAsia="Arial" w:hAnsi="Arial"/>
@@ -1389,22 +1294,25 @@
         </w:tc>
         <w:tc>
           <w:tcPr>
-            <w:tcW w:type="dxa" w:w="6800"/>
-            <w:tcBorders>
-              <w:top w:val="single" w:color="D9D9D6" w:sz="4"/>
-              <w:left w:val="single" w:color="D9D9D6" w:sz="4"/>
-              <w:bottom w:val="single" w:color="D9D9D6" w:sz="4"/>
-              <w:right w:val="single" w:color="D9D9D6" w:sz="4"/>
-            </w:tcBorders>
-            <w:shd w:fill="FFFFFF" w:color="auto" w:val="clear"/>
-            <w:tcMar>
-              <w:top w:type="dxa" w:w="70"/>
-              <w:left w:type="dxa" w:w="110"/>
-              <w:bottom w:type="dxa" w:w="70"/>
-              <w:right w:type="dxa" w:w="110"/>
-            </w:tcMar>
-          </w:tcPr>
-          <w:p>
+            <w:tcW w:type="dxa" w:w="8200"/>
+            <w:tcBorders>
+              <w:top w:val="single" w:color="D9D9D6" w:sz="4"/>
+              <w:left w:val="single" w:color="D9D9D6" w:sz="4"/>
+              <w:bottom w:val="single" w:color="D9D9D6" w:sz="4"/>
+              <w:right w:val="single" w:color="D9D9D6" w:sz="4"/>
+            </w:tcBorders>
+            <w:shd w:fill="FFFFFF" w:color="auto" w:val="clear"/>
+            <w:tcMar>
+              <w:top w:type="dxa" w:w="70"/>
+              <w:left w:type="dxa" w:w="110"/>
+              <w:bottom w:type="dxa" w:w="70"/>
+              <w:right w:type="dxa" w:w="110"/>
+            </w:tcMar>
+          </w:tcPr>
+          <w:p>
+            <w:pPr>
+              <w:keepNext/>
+            </w:pPr>
             <w:r>
               <w:rPr>
                 <w:rFonts w:ascii="Arial" w:cs="Arial" w:eastAsia="Arial" w:hAnsi="Arial"/>
@@ -1424,22 +1332,25 @@
         </w:trPr>
         <w:tc>
           <w:tcPr>
-            <w:tcW w:type="dxa" w:w="2600"/>
-            <w:tcBorders>
-              <w:top w:val="single" w:color="D9D9D6" w:sz="4"/>
-              <w:left w:val="single" w:color="D9D9D6" w:sz="4"/>
-              <w:bottom w:val="single" w:color="D9D9D6" w:sz="4"/>
-              <w:right w:val="single" w:color="D9D9D6" w:sz="4"/>
-            </w:tcBorders>
-            <w:shd w:fill="FFFFFF" w:color="auto" w:val="clear"/>
-            <w:tcMar>
-              <w:top w:type="dxa" w:w="70"/>
-              <w:left w:type="dxa" w:w="110"/>
-              <w:bottom w:type="dxa" w:w="70"/>
-              <w:right w:type="dxa" w:w="110"/>
-            </w:tcMar>
-          </w:tcPr>
-          <w:p>
+            <w:tcW w:type="dxa" w:w="2800"/>
+            <w:tcBorders>
+              <w:top w:val="single" w:color="D9D9D6" w:sz="4"/>
+              <w:left w:val="single" w:color="D9D9D6" w:sz="4"/>
+              <w:bottom w:val="single" w:color="D9D9D6" w:sz="4"/>
+              <w:right w:val="single" w:color="D9D9D6" w:sz="4"/>
+            </w:tcBorders>
+            <w:shd w:fill="FFFFFF" w:color="auto" w:val="clear"/>
+            <w:tcMar>
+              <w:top w:type="dxa" w:w="70"/>
+              <w:left w:type="dxa" w:w="110"/>
+              <w:bottom w:type="dxa" w:w="70"/>
+              <w:right w:type="dxa" w:w="110"/>
+            </w:tcMar>
+          </w:tcPr>
+          <w:p>
+            <w:pPr>
+              <w:keepNext w:val="false"/>
+            </w:pPr>
             <w:r>
               <w:rPr>
                 <w:rFonts w:ascii="Arial" w:cs="Arial" w:eastAsia="Arial" w:hAnsi="Arial"/>
@@ -1453,22 +1364,25 @@
         </w:tc>
         <w:tc>
           <w:tcPr>
-            <w:tcW w:type="dxa" w:w="6800"/>
-            <w:tcBorders>
-              <w:top w:val="single" w:color="D9D9D6" w:sz="4"/>
-              <w:left w:val="single" w:color="D9D9D6" w:sz="4"/>
-              <w:bottom w:val="single" w:color="D9D9D6" w:sz="4"/>
-              <w:right w:val="single" w:color="D9D9D6" w:sz="4"/>
-            </w:tcBorders>
-            <w:shd w:fill="FFFFFF" w:color="auto" w:val="clear"/>
-            <w:tcMar>
-              <w:top w:type="dxa" w:w="70"/>
-              <w:left w:type="dxa" w:w="110"/>
-              <w:bottom w:type="dxa" w:w="70"/>
-              <w:right w:type="dxa" w:w="110"/>
-            </w:tcMar>
-          </w:tcPr>
-          <w:p>
+            <w:tcW w:type="dxa" w:w="8200"/>
+            <w:tcBorders>
+              <w:top w:val="single" w:color="D9D9D6" w:sz="4"/>
+              <w:left w:val="single" w:color="D9D9D6" w:sz="4"/>
+              <w:bottom w:val="single" w:color="D9D9D6" w:sz="4"/>
+              <w:right w:val="single" w:color="D9D9D6" w:sz="4"/>
+            </w:tcBorders>
+            <w:shd w:fill="FFFFFF" w:color="auto" w:val="clear"/>
+            <w:tcMar>
+              <w:top w:type="dxa" w:w="70"/>
+              <w:left w:type="dxa" w:w="110"/>
+              <w:bottom w:type="dxa" w:w="70"/>
+              <w:right w:type="dxa" w:w="110"/>
+            </w:tcMar>
+          </w:tcPr>
+          <w:p>
+            <w:pPr>
+              <w:keepNext w:val="false"/>
+            </w:pPr>
             <w:r>
               <w:rPr>
                 <w:rFonts w:ascii="Arial" w:cs="Arial" w:eastAsia="Arial" w:hAnsi="Arial"/>
@@ -1504,56 +1418,9 @@
         <w:t xml:space="preserve">Performance &amp; Risk</w:t>
       </w:r>
     </w:p>
-    <w:p>
-      <w:pPr>
-        <w:keepNext w:val="false"/>
-        <w:spacing w:after="120" w:before="60"/>
-        <w:jc w:val="center"/>
-      </w:pPr>
-      <w:r>
-        <w:drawing>
-          <wp:inline distT="0" distB="0" distL="0" distR="0">
-            <wp:extent cx="6953250" cy="733425"/>
-            <wp:effectExtent t="0" r="0" b="0" l="0"/>
-            <wp:docPr id="1" name="" descr="" title=""/>
-            <wp:cNvGraphicFramePr>
-              <a:graphicFrameLocks xmlns:a="http://schemas.openxmlformats.org/drawingml/2006/main" noChangeAspect="1"/>
-            </wp:cNvGraphicFramePr>
-            <a:graphic xmlns:a="http://schemas.openxmlformats.org/drawingml/2006/main">
-              <a:graphicData uri="http://schemas.openxmlformats.org/drawingml/2006/picture">
-                <pic:pic xmlns:pic="http://schemas.openxmlformats.org/drawingml/2006/picture">
-                  <pic:nvPicPr>
-                    <pic:cNvPr id="0" name="" descr=""/>
-                    <pic:cNvPicPr>
-                      <a:picLocks noChangeAspect="1" noChangeArrowheads="1"/>
-                    </pic:cNvPicPr>
-                  </pic:nvPicPr>
-                  <pic:blipFill>
-                    <a:blip r:embed="rId13" cstate="none"/>
-                    <a:srcRect/>
-                    <a:stretch>
-                      <a:fillRect/>
-                    </a:stretch>
-                  </pic:blipFill>
-                  <pic:spPr bwMode="auto">
-                    <a:xfrm>
-                      <a:off x="0" y="0"/>
-                      <a:ext cx="6953250" cy="733425"/>
-                    </a:xfrm>
-                    <a:prstGeom prst="rect">
-                      <a:avLst/>
-                    </a:prstGeom>
-                  </pic:spPr>
-                </pic:pic>
-              </a:graphicData>
-            </a:graphic>
-          </wp:inline>
-        </w:drawing>
-      </w:r>
-    </w:p>
     <w:tbl>
       <w:tblPr>
-        <w:tblW w:type="dxa" w:w="9400"/>
+        <w:tblW w:type="dxa" w:w="11000"/>
         <w:tblBorders>
           <w:top w:val="single" w:color="auto" w:sz="4"/>
           <w:left w:val="single" w:color="auto" w:sz="4"/>
@@ -1564,8 +1431,8 @@
         </w:tblBorders>
       </w:tblPr>
       <w:tblGrid>
-        <w:gridCol w:w="2600"/>
-        <w:gridCol w:w="6800"/>
+        <w:gridCol w:w="2800"/>
+        <w:gridCol w:w="8200"/>
       </w:tblGrid>
       <w:tr>
         <w:trPr>
@@ -1574,7 +1441,7 @@
         </w:trPr>
         <w:tc>
           <w:tcPr>
-            <w:tcW w:type="dxa" w:w="2600"/>
+            <w:tcW w:type="dxa" w:w="2800"/>
             <w:tcBorders>
               <w:top w:val="single" w:color="D9D9D6" w:sz="4"/>
               <w:left w:val="single" w:color="D9D9D6" w:sz="4"/>
@@ -1590,6 +1457,9 @@
             </w:tcMar>
           </w:tcPr>
           <w:p>
+            <w:pPr>
+              <w:keepNext/>
+            </w:pPr>
             <w:r>
               <w:rPr>
                 <w:rFonts w:ascii="Arial" w:cs="Arial" w:eastAsia="Arial" w:hAnsi="Arial"/>
@@ -1605,7 +1475,7 @@
         </w:tc>
         <w:tc>
           <w:tcPr>
-            <w:tcW w:type="dxa" w:w="6800"/>
+            <w:tcW w:type="dxa" w:w="8200"/>
             <w:tcBorders>
               <w:top w:val="single" w:color="D9D9D6" w:sz="4"/>
               <w:left w:val="single" w:color="D9D9D6" w:sz="4"/>
@@ -1621,6 +1491,9 @@
             </w:tcMar>
           </w:tcPr>
           <w:p>
+            <w:pPr>
+              <w:keepNext/>
+            </w:pPr>
             <w:r>
               <w:rPr>
                 <w:rFonts w:ascii="Arial" w:cs="Arial" w:eastAsia="Arial" w:hAnsi="Arial"/>
@@ -1642,22 +1515,25 @@
         </w:trPr>
         <w:tc>
           <w:tcPr>
-            <w:tcW w:type="dxa" w:w="2600"/>
-            <w:tcBorders>
-              <w:top w:val="single" w:color="D9D9D6" w:sz="4"/>
-              <w:left w:val="single" w:color="D9D9D6" w:sz="4"/>
-              <w:bottom w:val="single" w:color="D9D9D6" w:sz="4"/>
-              <w:right w:val="single" w:color="D9D9D6" w:sz="4"/>
-            </w:tcBorders>
-            <w:shd w:fill="FFFFFF" w:color="auto" w:val="clear"/>
-            <w:tcMar>
-              <w:top w:type="dxa" w:w="70"/>
-              <w:left w:type="dxa" w:w="110"/>
-              <w:bottom w:type="dxa" w:w="70"/>
-              <w:right w:type="dxa" w:w="110"/>
-            </w:tcMar>
-          </w:tcPr>
-          <w:p>
+            <w:tcW w:type="dxa" w:w="2800"/>
+            <w:tcBorders>
+              <w:top w:val="single" w:color="D9D9D6" w:sz="4"/>
+              <w:left w:val="single" w:color="D9D9D6" w:sz="4"/>
+              <w:bottom w:val="single" w:color="D9D9D6" w:sz="4"/>
+              <w:right w:val="single" w:color="D9D9D6" w:sz="4"/>
+            </w:tcBorders>
+            <w:shd w:fill="FFFFFF" w:color="auto" w:val="clear"/>
+            <w:tcMar>
+              <w:top w:type="dxa" w:w="70"/>
+              <w:left w:type="dxa" w:w="110"/>
+              <w:bottom w:type="dxa" w:w="70"/>
+              <w:right w:type="dxa" w:w="110"/>
+            </w:tcMar>
+          </w:tcPr>
+          <w:p>
+            <w:pPr>
+              <w:keepNext/>
+            </w:pPr>
             <w:r>
               <w:rPr>
                 <w:rFonts w:ascii="Arial" w:cs="Arial" w:eastAsia="Arial" w:hAnsi="Arial"/>
@@ -1671,22 +1547,25 @@
         </w:tc>
         <w:tc>
           <w:tcPr>
-            <w:tcW w:type="dxa" w:w="6800"/>
-            <w:tcBorders>
-              <w:top w:val="single" w:color="D9D9D6" w:sz="4"/>
-              <w:left w:val="single" w:color="D9D9D6" w:sz="4"/>
-              <w:bottom w:val="single" w:color="D9D9D6" w:sz="4"/>
-              <w:right w:val="single" w:color="D9D9D6" w:sz="4"/>
-            </w:tcBorders>
-            <w:shd w:fill="FFFFFF" w:color="auto" w:val="clear"/>
-            <w:tcMar>
-              <w:top w:type="dxa" w:w="70"/>
-              <w:left w:type="dxa" w:w="110"/>
-              <w:bottom w:type="dxa" w:w="70"/>
-              <w:right w:type="dxa" w:w="110"/>
-            </w:tcMar>
-          </w:tcPr>
-          <w:p>
+            <w:tcW w:type="dxa" w:w="8200"/>
+            <w:tcBorders>
+              <w:top w:val="single" w:color="D9D9D6" w:sz="4"/>
+              <w:left w:val="single" w:color="D9D9D6" w:sz="4"/>
+              <w:bottom w:val="single" w:color="D9D9D6" w:sz="4"/>
+              <w:right w:val="single" w:color="D9D9D6" w:sz="4"/>
+            </w:tcBorders>
+            <w:shd w:fill="FFFFFF" w:color="auto" w:val="clear"/>
+            <w:tcMar>
+              <w:top w:type="dxa" w:w="70"/>
+              <w:left w:type="dxa" w:w="110"/>
+              <w:bottom w:type="dxa" w:w="70"/>
+              <w:right w:type="dxa" w:w="110"/>
+            </w:tcMar>
+          </w:tcPr>
+          <w:p>
+            <w:pPr>
+              <w:keepNext/>
+            </w:pPr>
             <w:r>
               <w:rPr>
                 <w:rFonts w:ascii="Arial" w:cs="Arial" w:eastAsia="Arial" w:hAnsi="Arial"/>
@@ -1706,22 +1585,25 @@
         </w:trPr>
         <w:tc>
           <w:tcPr>
-            <w:tcW w:type="dxa" w:w="2600"/>
-            <w:tcBorders>
-              <w:top w:val="single" w:color="D9D9D6" w:sz="4"/>
-              <w:left w:val="single" w:color="D9D9D6" w:sz="4"/>
-              <w:bottom w:val="single" w:color="D9D9D6" w:sz="4"/>
-              <w:right w:val="single" w:color="D9D9D6" w:sz="4"/>
-            </w:tcBorders>
-            <w:shd w:fill="FFFFFF" w:color="auto" w:val="clear"/>
-            <w:tcMar>
-              <w:top w:type="dxa" w:w="70"/>
-              <w:left w:type="dxa" w:w="110"/>
-              <w:bottom w:type="dxa" w:w="70"/>
-              <w:right w:type="dxa" w:w="110"/>
-            </w:tcMar>
-          </w:tcPr>
-          <w:p>
+            <w:tcW w:type="dxa" w:w="2800"/>
+            <w:tcBorders>
+              <w:top w:val="single" w:color="D9D9D6" w:sz="4"/>
+              <w:left w:val="single" w:color="D9D9D6" w:sz="4"/>
+              <w:bottom w:val="single" w:color="D9D9D6" w:sz="4"/>
+              <w:right w:val="single" w:color="D9D9D6" w:sz="4"/>
+            </w:tcBorders>
+            <w:shd w:fill="FFFFFF" w:color="auto" w:val="clear"/>
+            <w:tcMar>
+              <w:top w:type="dxa" w:w="70"/>
+              <w:left w:type="dxa" w:w="110"/>
+              <w:bottom w:type="dxa" w:w="70"/>
+              <w:right w:type="dxa" w:w="110"/>
+            </w:tcMar>
+          </w:tcPr>
+          <w:p>
+            <w:pPr>
+              <w:keepNext/>
+            </w:pPr>
             <w:r>
               <w:rPr>
                 <w:rFonts w:ascii="Arial" w:cs="Arial" w:eastAsia="Arial" w:hAnsi="Arial"/>
@@ -1735,22 +1617,25 @@
         </w:tc>
         <w:tc>
           <w:tcPr>
-            <w:tcW w:type="dxa" w:w="6800"/>
-            <w:tcBorders>
-              <w:top w:val="single" w:color="D9D9D6" w:sz="4"/>
-              <w:left w:val="single" w:color="D9D9D6" w:sz="4"/>
-              <w:bottom w:val="single" w:color="D9D9D6" w:sz="4"/>
-              <w:right w:val="single" w:color="D9D9D6" w:sz="4"/>
-            </w:tcBorders>
-            <w:shd w:fill="FFFFFF" w:color="auto" w:val="clear"/>
-            <w:tcMar>
-              <w:top w:type="dxa" w:w="70"/>
-              <w:left w:type="dxa" w:w="110"/>
-              <w:bottom w:type="dxa" w:w="70"/>
-              <w:right w:type="dxa" w:w="110"/>
-            </w:tcMar>
-          </w:tcPr>
-          <w:p>
+            <w:tcW w:type="dxa" w:w="8200"/>
+            <w:tcBorders>
+              <w:top w:val="single" w:color="D9D9D6" w:sz="4"/>
+              <w:left w:val="single" w:color="D9D9D6" w:sz="4"/>
+              <w:bottom w:val="single" w:color="D9D9D6" w:sz="4"/>
+              <w:right w:val="single" w:color="D9D9D6" w:sz="4"/>
+            </w:tcBorders>
+            <w:shd w:fill="FFFFFF" w:color="auto" w:val="clear"/>
+            <w:tcMar>
+              <w:top w:type="dxa" w:w="70"/>
+              <w:left w:type="dxa" w:w="110"/>
+              <w:bottom w:type="dxa" w:w="70"/>
+              <w:right w:type="dxa" w:w="110"/>
+            </w:tcMar>
+          </w:tcPr>
+          <w:p>
+            <w:pPr>
+              <w:keepNext/>
+            </w:pPr>
             <w:r>
               <w:rPr>
                 <w:rFonts w:ascii="Arial" w:cs="Arial" w:eastAsia="Arial" w:hAnsi="Arial"/>
@@ -1770,22 +1655,25 @@
         </w:trPr>
         <w:tc>
           <w:tcPr>
-            <w:tcW w:type="dxa" w:w="2600"/>
-            <w:tcBorders>
-              <w:top w:val="single" w:color="D9D9D6" w:sz="4"/>
-              <w:left w:val="single" w:color="D9D9D6" w:sz="4"/>
-              <w:bottom w:val="single" w:color="D9D9D6" w:sz="4"/>
-              <w:right w:val="single" w:color="D9D9D6" w:sz="4"/>
-            </w:tcBorders>
-            <w:shd w:fill="FFFFFF" w:color="auto" w:val="clear"/>
-            <w:tcMar>
-              <w:top w:type="dxa" w:w="70"/>
-              <w:left w:type="dxa" w:w="110"/>
-              <w:bottom w:type="dxa" w:w="70"/>
-              <w:right w:type="dxa" w:w="110"/>
-            </w:tcMar>
-          </w:tcPr>
-          <w:p>
+            <w:tcW w:type="dxa" w:w="2800"/>
+            <w:tcBorders>
+              <w:top w:val="single" w:color="D9D9D6" w:sz="4"/>
+              <w:left w:val="single" w:color="D9D9D6" w:sz="4"/>
+              <w:bottom w:val="single" w:color="D9D9D6" w:sz="4"/>
+              <w:right w:val="single" w:color="D9D9D6" w:sz="4"/>
+            </w:tcBorders>
+            <w:shd w:fill="FFFFFF" w:color="auto" w:val="clear"/>
+            <w:tcMar>
+              <w:top w:type="dxa" w:w="70"/>
+              <w:left w:type="dxa" w:w="110"/>
+              <w:bottom w:type="dxa" w:w="70"/>
+              <w:right w:type="dxa" w:w="110"/>
+            </w:tcMar>
+          </w:tcPr>
+          <w:p>
+            <w:pPr>
+              <w:keepNext w:val="false"/>
+            </w:pPr>
             <w:r>
               <w:rPr>
                 <w:rFonts w:ascii="Arial" w:cs="Arial" w:eastAsia="Arial" w:hAnsi="Arial"/>
@@ -1799,22 +1687,25 @@
         </w:tc>
         <w:tc>
           <w:tcPr>
-            <w:tcW w:type="dxa" w:w="6800"/>
-            <w:tcBorders>
-              <w:top w:val="single" w:color="D9D9D6" w:sz="4"/>
-              <w:left w:val="single" w:color="D9D9D6" w:sz="4"/>
-              <w:bottom w:val="single" w:color="D9D9D6" w:sz="4"/>
-              <w:right w:val="single" w:color="D9D9D6" w:sz="4"/>
-            </w:tcBorders>
-            <w:shd w:fill="FFFFFF" w:color="auto" w:val="clear"/>
-            <w:tcMar>
-              <w:top w:type="dxa" w:w="70"/>
-              <w:left w:type="dxa" w:w="110"/>
-              <w:bottom w:type="dxa" w:w="70"/>
-              <w:right w:type="dxa" w:w="110"/>
-            </w:tcMar>
-          </w:tcPr>
-          <w:p>
+            <w:tcW w:type="dxa" w:w="8200"/>
+            <w:tcBorders>
+              <w:top w:val="single" w:color="D9D9D6" w:sz="4"/>
+              <w:left w:val="single" w:color="D9D9D6" w:sz="4"/>
+              <w:bottom w:val="single" w:color="D9D9D6" w:sz="4"/>
+              <w:right w:val="single" w:color="D9D9D6" w:sz="4"/>
+            </w:tcBorders>
+            <w:shd w:fill="FFFFFF" w:color="auto" w:val="clear"/>
+            <w:tcMar>
+              <w:top w:type="dxa" w:w="70"/>
+              <w:left w:type="dxa" w:w="110"/>
+              <w:bottom w:type="dxa" w:w="70"/>
+              <w:right w:type="dxa" w:w="110"/>
+            </w:tcMar>
+          </w:tcPr>
+          <w:p>
+            <w:pPr>
+              <w:keepNext w:val="false"/>
+            </w:pPr>
             <w:r>
               <w:rPr>
                 <w:rFonts w:ascii="Arial" w:cs="Arial" w:eastAsia="Arial" w:hAnsi="Arial"/>
@@ -1850,56 +1741,9 @@
         <w:t xml:space="preserve">Exit Interviews</w:t>
       </w:r>
     </w:p>
-    <w:p>
-      <w:pPr>
-        <w:keepNext w:val="false"/>
-        <w:spacing w:after="120" w:before="60"/>
-        <w:jc w:val="center"/>
-      </w:pPr>
-      <w:r>
-        <w:drawing>
-          <wp:inline distT="0" distB="0" distL="0" distR="0">
-            <wp:extent cx="6953250" cy="523875"/>
-            <wp:effectExtent t="0" r="0" b="0" l="0"/>
-            <wp:docPr id="1" name="" descr="" title=""/>
-            <wp:cNvGraphicFramePr>
-              <a:graphicFrameLocks xmlns:a="http://schemas.openxmlformats.org/drawingml/2006/main" noChangeAspect="1"/>
-            </wp:cNvGraphicFramePr>
-            <a:graphic xmlns:a="http://schemas.openxmlformats.org/drawingml/2006/main">
-              <a:graphicData uri="http://schemas.openxmlformats.org/drawingml/2006/picture">
-                <pic:pic xmlns:pic="http://schemas.openxmlformats.org/drawingml/2006/picture">
-                  <pic:nvPicPr>
-                    <pic:cNvPr id="0" name="" descr=""/>
-                    <pic:cNvPicPr>
-                      <a:picLocks noChangeAspect="1" noChangeArrowheads="1"/>
-                    </pic:cNvPicPr>
-                  </pic:nvPicPr>
-                  <pic:blipFill>
-                    <a:blip r:embed="rId14" cstate="none"/>
-                    <a:srcRect/>
-                    <a:stretch>
-                      <a:fillRect/>
-                    </a:stretch>
-                  </pic:blipFill>
-                  <pic:spPr bwMode="auto">
-                    <a:xfrm>
-                      <a:off x="0" y="0"/>
-                      <a:ext cx="6953250" cy="523875"/>
-                    </a:xfrm>
-                    <a:prstGeom prst="rect">
-                      <a:avLst/>
-                    </a:prstGeom>
-                  </pic:spPr>
-                </pic:pic>
-              </a:graphicData>
-            </a:graphic>
-          </wp:inline>
-        </w:drawing>
-      </w:r>
-    </w:p>
     <w:tbl>
       <w:tblPr>
-        <w:tblW w:type="dxa" w:w="9400"/>
+        <w:tblW w:type="dxa" w:w="11000"/>
         <w:tblBorders>
           <w:top w:val="single" w:color="auto" w:sz="4"/>
           <w:left w:val="single" w:color="auto" w:sz="4"/>
@@ -1910,8 +1754,8 @@
         </w:tblBorders>
       </w:tblPr>
       <w:tblGrid>
-        <w:gridCol w:w="2600"/>
-        <w:gridCol w:w="6800"/>
+        <w:gridCol w:w="2800"/>
+        <w:gridCol w:w="8200"/>
       </w:tblGrid>
       <w:tr>
         <w:trPr>
@@ -1920,7 +1764,7 @@
         </w:trPr>
         <w:tc>
           <w:tcPr>
-            <w:tcW w:type="dxa" w:w="2600"/>
+            <w:tcW w:type="dxa" w:w="2800"/>
             <w:tcBorders>
               <w:top w:val="single" w:color="D9D9D6" w:sz="4"/>
               <w:left w:val="single" w:color="D9D9D6" w:sz="4"/>
@@ -1936,6 +1780,9 @@
             </w:tcMar>
           </w:tcPr>
           <w:p>
+            <w:pPr>
+              <w:keepNext/>
+            </w:pPr>
             <w:r>
               <w:rPr>
                 <w:rFonts w:ascii="Arial" w:cs="Arial" w:eastAsia="Arial" w:hAnsi="Arial"/>
@@ -1951,7 +1798,7 @@
         </w:tc>
         <w:tc>
           <w:tcPr>
-            <w:tcW w:type="dxa" w:w="6800"/>
+            <w:tcW w:type="dxa" w:w="8200"/>
             <w:tcBorders>
               <w:top w:val="single" w:color="D9D9D6" w:sz="4"/>
               <w:left w:val="single" w:color="D9D9D6" w:sz="4"/>
@@ -1967,6 +1814,9 @@
             </w:tcMar>
           </w:tcPr>
           <w:p>
+            <w:pPr>
+              <w:keepNext/>
+            </w:pPr>
             <w:r>
               <w:rPr>
                 <w:rFonts w:ascii="Arial" w:cs="Arial" w:eastAsia="Arial" w:hAnsi="Arial"/>
@@ -1988,22 +1838,25 @@
         </w:trPr>
         <w:tc>
           <w:tcPr>
-            <w:tcW w:type="dxa" w:w="2600"/>
-            <w:tcBorders>
-              <w:top w:val="single" w:color="D9D9D6" w:sz="4"/>
-              <w:left w:val="single" w:color="D9D9D6" w:sz="4"/>
-              <w:bottom w:val="single" w:color="D9D9D6" w:sz="4"/>
-              <w:right w:val="single" w:color="D9D9D6" w:sz="4"/>
-            </w:tcBorders>
-            <w:shd w:fill="FFFFFF" w:color="auto" w:val="clear"/>
-            <w:tcMar>
-              <w:top w:type="dxa" w:w="70"/>
-              <w:left w:type="dxa" w:w="110"/>
-              <w:bottom w:type="dxa" w:w="70"/>
-              <w:right w:type="dxa" w:w="110"/>
-            </w:tcMar>
-          </w:tcPr>
-          <w:p>
+            <w:tcW w:type="dxa" w:w="2800"/>
+            <w:tcBorders>
+              <w:top w:val="single" w:color="D9D9D6" w:sz="4"/>
+              <w:left w:val="single" w:color="D9D9D6" w:sz="4"/>
+              <w:bottom w:val="single" w:color="D9D9D6" w:sz="4"/>
+              <w:right w:val="single" w:color="D9D9D6" w:sz="4"/>
+            </w:tcBorders>
+            <w:shd w:fill="FFFFFF" w:color="auto" w:val="clear"/>
+            <w:tcMar>
+              <w:top w:type="dxa" w:w="70"/>
+              <w:left w:type="dxa" w:w="110"/>
+              <w:bottom w:type="dxa" w:w="70"/>
+              <w:right w:type="dxa" w:w="110"/>
+            </w:tcMar>
+          </w:tcPr>
+          <w:p>
+            <w:pPr>
+              <w:keepNext w:val="false"/>
+            </w:pPr>
             <w:r>
               <w:rPr>
                 <w:rFonts w:ascii="Arial" w:cs="Arial" w:eastAsia="Arial" w:hAnsi="Arial"/>
@@ -2017,22 +1870,25 @@
         </w:tc>
         <w:tc>
           <w:tcPr>
-            <w:tcW w:type="dxa" w:w="6800"/>
-            <w:tcBorders>
-              <w:top w:val="single" w:color="D9D9D6" w:sz="4"/>
-              <w:left w:val="single" w:color="D9D9D6" w:sz="4"/>
-              <w:bottom w:val="single" w:color="D9D9D6" w:sz="4"/>
-              <w:right w:val="single" w:color="D9D9D6" w:sz="4"/>
-            </w:tcBorders>
-            <w:shd w:fill="FFFFFF" w:color="auto" w:val="clear"/>
-            <w:tcMar>
-              <w:top w:type="dxa" w:w="70"/>
-              <w:left w:type="dxa" w:w="110"/>
-              <w:bottom w:type="dxa" w:w="70"/>
-              <w:right w:type="dxa" w:w="110"/>
-            </w:tcMar>
-          </w:tcPr>
-          <w:p>
+            <w:tcW w:type="dxa" w:w="8200"/>
+            <w:tcBorders>
+              <w:top w:val="single" w:color="D9D9D6" w:sz="4"/>
+              <w:left w:val="single" w:color="D9D9D6" w:sz="4"/>
+              <w:bottom w:val="single" w:color="D9D9D6" w:sz="4"/>
+              <w:right w:val="single" w:color="D9D9D6" w:sz="4"/>
+            </w:tcBorders>
+            <w:shd w:fill="FFFFFF" w:color="auto" w:val="clear"/>
+            <w:tcMar>
+              <w:top w:type="dxa" w:w="70"/>
+              <w:left w:type="dxa" w:w="110"/>
+              <w:bottom w:type="dxa" w:w="70"/>
+              <w:right w:type="dxa" w:w="110"/>
+            </w:tcMar>
+          </w:tcPr>
+          <w:p>
+            <w:pPr>
+              <w:keepNext w:val="false"/>
+            </w:pPr>
             <w:r>
               <w:rPr>
                 <w:rFonts w:ascii="Arial" w:cs="Arial" w:eastAsia="Arial" w:hAnsi="Arial"/>
@@ -2110,101 +1966,7 @@
     </w:p>
     <w:p>
       <w:pPr>
-        <w:keepNext w:val="false"/>
-        <w:spacing w:after="120" w:before="60"/>
-        <w:jc w:val="center"/>
-      </w:pPr>
-      <w:r>
-        <w:drawing>
-          <wp:inline distT="0" distB="0" distL="0" distR="0">
-            <wp:extent cx="6953250" cy="304800"/>
-            <wp:effectExtent t="0" r="0" b="0" l="0"/>
-            <wp:docPr id="1" name="" descr="" title=""/>
-            <wp:cNvGraphicFramePr>
-              <a:graphicFrameLocks xmlns:a="http://schemas.openxmlformats.org/drawingml/2006/main" noChangeAspect="1"/>
-            </wp:cNvGraphicFramePr>
-            <a:graphic xmlns:a="http://schemas.openxmlformats.org/drawingml/2006/main">
-              <a:graphicData uri="http://schemas.openxmlformats.org/drawingml/2006/picture">
-                <pic:pic xmlns:pic="http://schemas.openxmlformats.org/drawingml/2006/picture">
-                  <pic:nvPicPr>
-                    <pic:cNvPr id="0" name="" descr=""/>
-                    <pic:cNvPicPr>
-                      <a:picLocks noChangeAspect="1" noChangeArrowheads="1"/>
-                    </pic:cNvPicPr>
-                  </pic:nvPicPr>
-                  <pic:blipFill>
-                    <a:blip r:embed="rId15" cstate="none"/>
-                    <a:srcRect/>
-                    <a:stretch>
-                      <a:fillRect/>
-                    </a:stretch>
-                  </pic:blipFill>
-                  <pic:spPr bwMode="auto">
-                    <a:xfrm>
-                      <a:off x="0" y="0"/>
-                      <a:ext cx="6953250" cy="304800"/>
-                    </a:xfrm>
-                    <a:prstGeom prst="rect">
-                      <a:avLst/>
-                    </a:prstGeom>
-                  </pic:spPr>
-                </pic:pic>
-              </a:graphicData>
-            </a:graphic>
-          </wp:inline>
-        </w:drawing>
-      </w:r>
-    </w:p>
-    <w:p>
-      <w:pPr>
-        <w:keepNext/>
-        <w:spacing w:after="120" w:before="60"/>
-        <w:jc w:val="center"/>
-      </w:pPr>
-      <w:r>
-        <w:drawing>
-          <wp:inline distT="0" distB="0" distL="0" distR="0">
-            <wp:extent cx="6953250" cy="904875"/>
-            <wp:effectExtent t="0" r="0" b="0" l="0"/>
-            <wp:docPr id="1" name="" descr="" title=""/>
-            <wp:cNvGraphicFramePr>
-              <a:graphicFrameLocks xmlns:a="http://schemas.openxmlformats.org/drawingml/2006/main" noChangeAspect="1"/>
-            </wp:cNvGraphicFramePr>
-            <a:graphic xmlns:a="http://schemas.openxmlformats.org/drawingml/2006/main">
-              <a:graphicData uri="http://schemas.openxmlformats.org/drawingml/2006/picture">
-                <pic:pic xmlns:pic="http://schemas.openxmlformats.org/drawingml/2006/picture">
-                  <pic:nvPicPr>
-                    <pic:cNvPr id="0" name="" descr=""/>
-                    <pic:cNvPicPr>
-                      <a:picLocks noChangeAspect="1" noChangeArrowheads="1"/>
-                    </pic:cNvPicPr>
-                  </pic:nvPicPr>
-                  <pic:blipFill>
-                    <a:blip r:embed="rId16" cstate="none"/>
-                    <a:srcRect/>
-                    <a:stretch>
-                      <a:fillRect/>
-                    </a:stretch>
-                  </pic:blipFill>
-                  <pic:spPr bwMode="auto">
-                    <a:xfrm>
-                      <a:off x="0" y="0"/>
-                      <a:ext cx="6953250" cy="904875"/>
-                    </a:xfrm>
-                    <a:prstGeom prst="rect">
-                      <a:avLst/>
-                    </a:prstGeom>
-                  </pic:spPr>
-                </pic:pic>
-              </a:graphicData>
-            </a:graphic>
-          </wp:inline>
-        </w:drawing>
-      </w:r>
-    </w:p>
-    <w:p>
-      <w:pPr>
-        <w:spacing w:after="70" w:line="270"/>
+        <w:spacing w:after="90" w:line="290"/>
       </w:pPr>
       <w:r>
         <w:rPr>
@@ -2218,54 +1980,7 @@
     </w:p>
     <w:p>
       <w:pPr>
-        <w:keepNext/>
-        <w:spacing w:after="120" w:before="60"/>
-        <w:jc w:val="center"/>
-      </w:pPr>
-      <w:r>
-        <w:drawing>
-          <wp:inline distT="0" distB="0" distL="0" distR="0">
-            <wp:extent cx="6953250" cy="466725"/>
-            <wp:effectExtent t="0" r="0" b="0" l="0"/>
-            <wp:docPr id="1" name="" descr="" title=""/>
-            <wp:cNvGraphicFramePr>
-              <a:graphicFrameLocks xmlns:a="http://schemas.openxmlformats.org/drawingml/2006/main" noChangeAspect="1"/>
-            </wp:cNvGraphicFramePr>
-            <a:graphic xmlns:a="http://schemas.openxmlformats.org/drawingml/2006/main">
-              <a:graphicData uri="http://schemas.openxmlformats.org/drawingml/2006/picture">
-                <pic:pic xmlns:pic="http://schemas.openxmlformats.org/drawingml/2006/picture">
-                  <pic:nvPicPr>
-                    <pic:cNvPr id="0" name="" descr=""/>
-                    <pic:cNvPicPr>
-                      <a:picLocks noChangeAspect="1" noChangeArrowheads="1"/>
-                    </pic:cNvPicPr>
-                  </pic:nvPicPr>
-                  <pic:blipFill>
-                    <a:blip r:embed="rId17" cstate="none"/>
-                    <a:srcRect/>
-                    <a:stretch>
-                      <a:fillRect/>
-                    </a:stretch>
-                  </pic:blipFill>
-                  <pic:spPr bwMode="auto">
-                    <a:xfrm>
-                      <a:off x="0" y="0"/>
-                      <a:ext cx="6953250" cy="466725"/>
-                    </a:xfrm>
-                    <a:prstGeom prst="rect">
-                      <a:avLst/>
-                    </a:prstGeom>
-                  </pic:spPr>
-                </pic:pic>
-              </a:graphicData>
-            </a:graphic>
-          </wp:inline>
-        </w:drawing>
-      </w:r>
-    </w:p>
-    <w:p>
-      <w:pPr>
-        <w:spacing w:after="70" w:line="270"/>
+        <w:spacing w:after="90" w:line="290"/>
       </w:pPr>
       <w:r>
         <w:rPr>

</xml_diff>